<commit_message>
Improve cross-panel Validate EDV, parallel Phase 2/4, and duplicate field handling
- Validate EDV agent: handle cross-panel parent dropdowns without skipping
  the rule when child field has intra-panel destinations
- Inter-panel dispatcher: parallelize Phase 2, Phase 4a, Phase 4b agent calls;
  add deterministic derivation→validate_edv reclassification using EDV keywords;
  handle multi-target detection format (target_panels[] expansion)
- Convert to API format: support duplicate field names within a panel using
  occurrence-based index matching; sync ARRAY_END variableNames from ARRAY_HDR
- Validate EDV dispatcher: build and pass ALL_PANELS_INDEX for cross-panel
  source field resolution
- Add Pidilite block-unblock BUD v1.3 documents and Extension BUD 2.0
- Add build_complex_rules.py and verify_validate_edv.py utility scripts

Co-Authored-By: Claude Opus 4.6 (1M context) <noreply@anthropic.com>
</commit_message>
<xml_diff>
--- a/documents/Vendor Extension BUD-cross-panel.docx
+++ b/documents/Vendor Extension BUD-cross-panel.docx
@@ -23,7 +23,7 @@
         <mc:AlternateContent>
           <mc:Choice Requires="wpg">
             <w:drawing>
-              <wp:anchor distT="0" distB="0" distL="0" distR="0" simplePos="0" relativeHeight="86" behindDoc="1" locked="0" layoutInCell="0" allowOverlap="1" wp14:anchorId="0B4299A4">
+              <wp:anchor distT="0" distB="0" distL="0" distR="0" simplePos="0" relativeHeight="83" behindDoc="1" locked="0" layoutInCell="0" allowOverlap="1" wp14:anchorId="0B4299A4">
                 <wp:simplePos x="0" y="0"/>
                 <wp:positionH relativeFrom="page">
                   <wp:posOffset>299720</wp:posOffset>
@@ -53,7 +53,7 @@
                         <wps:spPr>
                           <a:xfrm>
                             <a:off x="0" y="0"/>
-                            <a:ext cx="192240" cy="9948600"/>
+                            <a:ext cx="191880" cy="9948600"/>
                           </a:xfrm>
                           <a:prstGeom prst="rect">
                             <a:avLst/>
@@ -87,7 +87,7 @@
                         <wps:spPr>
                           <a:xfrm>
                             <a:off x="0" y="1599480"/>
-                            <a:ext cx="2194560" cy="600120"/>
+                            <a:ext cx="2194560" cy="599400"/>
                           </a:xfrm>
                           <a:prstGeom prst="homePlate">
                             <a:avLst>
@@ -167,7 +167,7 @@
           <mc:Fallback>
             <w:pict>
               <v:group id="shape_0" alt="Group 1" style="position:absolute;margin-left:23.6pt;margin-top:21.3pt;width:172.8pt;height:783.35pt" coordorigin="472,426" coordsize="3456,15667">
-                <v:rect id="shape_0" fillcolor="#e50022" stroked="f" o:allowincell="f" style="position:absolute;left:472;top:426;width:302;height:15666;mso-wrap-style:none;v-text-anchor:middle;mso-position-horizontal-relative:page;mso-position-vertical-relative:page">
+                <v:rect id="shape_0" fillcolor="#e50022" stroked="f" o:allowincell="f" style="position:absolute;left:472;top:426;width:301;height:15666;mso-wrap-style:none;v-text-anchor:middle;mso-position-horizontal-relative:page;mso-position-vertical-relative:page">
                   <v:fill o:detectmouseclick="t" type="solid" color2="#1affdd"/>
                   <v:stroke color="#3465a4" weight="12600" joinstyle="miter" endcap="flat"/>
                   <w10:wrap type="none"/>
@@ -187,7 +187,7 @@
                     <v:h position="@2,0"/>
                   </v:handles>
                 </v:shapetype>
-                <v:shape id="shape_0" fillcolor="#e50022" stroked="f" o:allowincell="f" style="position:absolute;left:472;top:2945;width:3455;height:944;mso-wrap-style:square;v-text-anchor:middle;mso-position-horizontal-relative:page;mso-position-vertical-relative:page" type="_x0000_t15" path="m0,0l-2147483639,0l-2147483633,-2147483635l-2147483639,-2147483634l0,-2147483634xe">
+                <v:shape id="shape_0" fillcolor="#e50022" stroked="f" o:allowincell="f" style="position:absolute;left:472;top:2945;width:3455;height:943;mso-wrap-style:square;v-text-anchor:middle;mso-position-horizontal-relative:page;mso-position-vertical-relative:page" type="_x0000_t15" path="m0,0l-2147483639,0l-2147483633,-2147483635l-2147483639,-2147483634l0,-2147483634xe">
                   <v:fill o:detectmouseclick="t" type="solid" color2="#1affdd"/>
                   <v:stroke color="#3465a4" weight="12600" joinstyle="miter" endcap="flat"/>
                   <v:textbox>
@@ -713,34 +713,28 @@
             </w:r>
             <w:r>
               <w:rPr>
+                <w:webHidden/>
+              </w:rPr>
+              <w:fldChar w:fldCharType="begin"/>
+            </w:r>
+            <w:r>
+              <w:rPr>
+                <w:webHidden/>
+              </w:rPr>
+              <w:instrText xml:space="preserve">PAGEREF _Toc218955531 \h</w:instrText>
+            </w:r>
+            <w:r>
+              <w:rPr>
+                <w:webHidden/>
+              </w:rPr>
+              <w:fldChar w:fldCharType="separate"/>
+            </w:r>
+            <w:r>
+              <w:rPr>
                 <w:rStyle w:val="IndexLink"/>
                 <w:vanish w:val="false"/>
               </w:rPr>
               <w:tab/>
-            </w:r>
-            <w:r>
-              <w:rPr>
-                <w:webHidden/>
-              </w:rPr>
-              <w:fldChar w:fldCharType="begin"/>
-            </w:r>
-            <w:r>
-              <w:rPr>
-                <w:webHidden/>
-              </w:rPr>
-              <w:instrText xml:space="preserve">PAGEREF _Toc218955531 \h</w:instrText>
-            </w:r>
-            <w:r>
-              <w:rPr>
-                <w:webHidden/>
-              </w:rPr>
-              <w:fldChar w:fldCharType="separate"/>
-            </w:r>
-            <w:r>
-              <w:rPr>
-                <w:rStyle w:val="IndexLink"/>
-                <w:vanish/>
-              </w:rPr>
               <w:t>3</w:t>
             </w:r>
             <w:r>
@@ -779,34 +773,28 @@
             </w:r>
             <w:r>
               <w:rPr>
+                <w:webHidden/>
+              </w:rPr>
+              <w:fldChar w:fldCharType="begin"/>
+            </w:r>
+            <w:r>
+              <w:rPr>
+                <w:webHidden/>
+              </w:rPr>
+              <w:instrText xml:space="preserve">PAGEREF _Toc218955532 \h</w:instrText>
+            </w:r>
+            <w:r>
+              <w:rPr>
+                <w:webHidden/>
+              </w:rPr>
+              <w:fldChar w:fldCharType="separate"/>
+            </w:r>
+            <w:r>
+              <w:rPr>
                 <w:rStyle w:val="IndexLink"/>
                 <w:vanish w:val="false"/>
               </w:rPr>
               <w:tab/>
-            </w:r>
-            <w:r>
-              <w:rPr>
-                <w:webHidden/>
-              </w:rPr>
-              <w:fldChar w:fldCharType="begin"/>
-            </w:r>
-            <w:r>
-              <w:rPr>
-                <w:webHidden/>
-              </w:rPr>
-              <w:instrText xml:space="preserve">PAGEREF _Toc218955532 \h</w:instrText>
-            </w:r>
-            <w:r>
-              <w:rPr>
-                <w:webHidden/>
-              </w:rPr>
-              <w:fldChar w:fldCharType="separate"/>
-            </w:r>
-            <w:r>
-              <w:rPr>
-                <w:rStyle w:val="IndexLink"/>
-                <w:vanish/>
-              </w:rPr>
               <w:t>3</w:t>
             </w:r>
             <w:r>
@@ -846,34 +834,28 @@
             </w:r>
             <w:r>
               <w:rPr>
+                <w:webHidden/>
+              </w:rPr>
+              <w:fldChar w:fldCharType="begin"/>
+            </w:r>
+            <w:r>
+              <w:rPr>
+                <w:webHidden/>
+              </w:rPr>
+              <w:instrText xml:space="preserve">PAGEREF _Toc218955533 \h</w:instrText>
+            </w:r>
+            <w:r>
+              <w:rPr>
+                <w:webHidden/>
+              </w:rPr>
+              <w:fldChar w:fldCharType="separate"/>
+            </w:r>
+            <w:r>
+              <w:rPr>
                 <w:rStyle w:val="IndexLink"/>
                 <w:vanish w:val="false"/>
               </w:rPr>
               <w:tab/>
-            </w:r>
-            <w:r>
-              <w:rPr>
-                <w:webHidden/>
-              </w:rPr>
-              <w:fldChar w:fldCharType="begin"/>
-            </w:r>
-            <w:r>
-              <w:rPr>
-                <w:webHidden/>
-              </w:rPr>
-              <w:instrText xml:space="preserve">PAGEREF _Toc218955533 \h</w:instrText>
-            </w:r>
-            <w:r>
-              <w:rPr>
-                <w:webHidden/>
-              </w:rPr>
-              <w:fldChar w:fldCharType="separate"/>
-            </w:r>
-            <w:r>
-              <w:rPr>
-                <w:rStyle w:val="IndexLink"/>
-                <w:vanish/>
-              </w:rPr>
               <w:t>3</w:t>
             </w:r>
             <w:r>
@@ -913,34 +895,28 @@
             </w:r>
             <w:r>
               <w:rPr>
+                <w:webHidden/>
+              </w:rPr>
+              <w:fldChar w:fldCharType="begin"/>
+            </w:r>
+            <w:r>
+              <w:rPr>
+                <w:webHidden/>
+              </w:rPr>
+              <w:instrText xml:space="preserve">PAGEREF _Toc218955534 \h</w:instrText>
+            </w:r>
+            <w:r>
+              <w:rPr>
+                <w:webHidden/>
+              </w:rPr>
+              <w:fldChar w:fldCharType="separate"/>
+            </w:r>
+            <w:r>
+              <w:rPr>
                 <w:rStyle w:val="IndexLink"/>
                 <w:vanish w:val="false"/>
               </w:rPr>
               <w:tab/>
-            </w:r>
-            <w:r>
-              <w:rPr>
-                <w:webHidden/>
-              </w:rPr>
-              <w:fldChar w:fldCharType="begin"/>
-            </w:r>
-            <w:r>
-              <w:rPr>
-                <w:webHidden/>
-              </w:rPr>
-              <w:instrText xml:space="preserve">PAGEREF _Toc218955534 \h</w:instrText>
-            </w:r>
-            <w:r>
-              <w:rPr>
-                <w:webHidden/>
-              </w:rPr>
-              <w:fldChar w:fldCharType="separate"/>
-            </w:r>
-            <w:r>
-              <w:rPr>
-                <w:rStyle w:val="IndexLink"/>
-                <w:vanish/>
-              </w:rPr>
               <w:t>3</w:t>
             </w:r>
             <w:r>
@@ -980,34 +956,28 @@
             </w:r>
             <w:r>
               <w:rPr>
+                <w:webHidden/>
+              </w:rPr>
+              <w:fldChar w:fldCharType="begin"/>
+            </w:r>
+            <w:r>
+              <w:rPr>
+                <w:webHidden/>
+              </w:rPr>
+              <w:instrText xml:space="preserve">PAGEREF _Toc218955535 \h</w:instrText>
+            </w:r>
+            <w:r>
+              <w:rPr>
+                <w:webHidden/>
+              </w:rPr>
+              <w:fldChar w:fldCharType="separate"/>
+            </w:r>
+            <w:r>
+              <w:rPr>
                 <w:rStyle w:val="IndexLink"/>
                 <w:vanish w:val="false"/>
               </w:rPr>
               <w:tab/>
-            </w:r>
-            <w:r>
-              <w:rPr>
-                <w:webHidden/>
-              </w:rPr>
-              <w:fldChar w:fldCharType="begin"/>
-            </w:r>
-            <w:r>
-              <w:rPr>
-                <w:webHidden/>
-              </w:rPr>
-              <w:instrText xml:space="preserve">PAGEREF _Toc218955535 \h</w:instrText>
-            </w:r>
-            <w:r>
-              <w:rPr>
-                <w:webHidden/>
-              </w:rPr>
-              <w:fldChar w:fldCharType="separate"/>
-            </w:r>
-            <w:r>
-              <w:rPr>
-                <w:rStyle w:val="IndexLink"/>
-                <w:vanish/>
-              </w:rPr>
               <w:t>3</w:t>
             </w:r>
             <w:r>
@@ -1047,34 +1017,28 @@
             </w:r>
             <w:r>
               <w:rPr>
+                <w:webHidden/>
+              </w:rPr>
+              <w:fldChar w:fldCharType="begin"/>
+            </w:r>
+            <w:r>
+              <w:rPr>
+                <w:webHidden/>
+              </w:rPr>
+              <w:instrText xml:space="preserve">PAGEREF _Toc218955536 \h</w:instrText>
+            </w:r>
+            <w:r>
+              <w:rPr>
+                <w:webHidden/>
+              </w:rPr>
+              <w:fldChar w:fldCharType="separate"/>
+            </w:r>
+            <w:r>
+              <w:rPr>
                 <w:rStyle w:val="IndexLink"/>
                 <w:vanish w:val="false"/>
               </w:rPr>
               <w:tab/>
-            </w:r>
-            <w:r>
-              <w:rPr>
-                <w:webHidden/>
-              </w:rPr>
-              <w:fldChar w:fldCharType="begin"/>
-            </w:r>
-            <w:r>
-              <w:rPr>
-                <w:webHidden/>
-              </w:rPr>
-              <w:instrText xml:space="preserve">PAGEREF _Toc218955536 \h</w:instrText>
-            </w:r>
-            <w:r>
-              <w:rPr>
-                <w:webHidden/>
-              </w:rPr>
-              <w:fldChar w:fldCharType="separate"/>
-            </w:r>
-            <w:r>
-              <w:rPr>
-                <w:rStyle w:val="IndexLink"/>
-                <w:vanish/>
-              </w:rPr>
               <w:t>3</w:t>
             </w:r>
             <w:r>
@@ -1114,34 +1078,28 @@
             </w:r>
             <w:r>
               <w:rPr>
+                <w:webHidden/>
+              </w:rPr>
+              <w:fldChar w:fldCharType="begin"/>
+            </w:r>
+            <w:r>
+              <w:rPr>
+                <w:webHidden/>
+              </w:rPr>
+              <w:instrText xml:space="preserve">PAGEREF _Toc218955537 \h</w:instrText>
+            </w:r>
+            <w:r>
+              <w:rPr>
+                <w:webHidden/>
+              </w:rPr>
+              <w:fldChar w:fldCharType="separate"/>
+            </w:r>
+            <w:r>
+              <w:rPr>
                 <w:rStyle w:val="IndexLink"/>
                 <w:vanish w:val="false"/>
               </w:rPr>
               <w:tab/>
-            </w:r>
-            <w:r>
-              <w:rPr>
-                <w:webHidden/>
-              </w:rPr>
-              <w:fldChar w:fldCharType="begin"/>
-            </w:r>
-            <w:r>
-              <w:rPr>
-                <w:webHidden/>
-              </w:rPr>
-              <w:instrText xml:space="preserve">PAGEREF _Toc218955537 \h</w:instrText>
-            </w:r>
-            <w:r>
-              <w:rPr>
-                <w:webHidden/>
-              </w:rPr>
-              <w:fldChar w:fldCharType="separate"/>
-            </w:r>
-            <w:r>
-              <w:rPr>
-                <w:rStyle w:val="IndexLink"/>
-                <w:vanish/>
-              </w:rPr>
               <w:t>4</w:t>
             </w:r>
             <w:r>
@@ -1181,34 +1139,28 @@
             </w:r>
             <w:r>
               <w:rPr>
+                <w:webHidden/>
+              </w:rPr>
+              <w:fldChar w:fldCharType="begin"/>
+            </w:r>
+            <w:r>
+              <w:rPr>
+                <w:webHidden/>
+              </w:rPr>
+              <w:instrText xml:space="preserve">PAGEREF _Toc218955538 \h</w:instrText>
+            </w:r>
+            <w:r>
+              <w:rPr>
+                <w:webHidden/>
+              </w:rPr>
+              <w:fldChar w:fldCharType="separate"/>
+            </w:r>
+            <w:r>
+              <w:rPr>
                 <w:rStyle w:val="IndexLink"/>
                 <w:vanish w:val="false"/>
               </w:rPr>
               <w:tab/>
-            </w:r>
-            <w:r>
-              <w:rPr>
-                <w:webHidden/>
-              </w:rPr>
-              <w:fldChar w:fldCharType="begin"/>
-            </w:r>
-            <w:r>
-              <w:rPr>
-                <w:webHidden/>
-              </w:rPr>
-              <w:instrText xml:space="preserve">PAGEREF _Toc218955538 \h</w:instrText>
-            </w:r>
-            <w:r>
-              <w:rPr>
-                <w:webHidden/>
-              </w:rPr>
-              <w:fldChar w:fldCharType="separate"/>
-            </w:r>
-            <w:r>
-              <w:rPr>
-                <w:rStyle w:val="IndexLink"/>
-                <w:vanish/>
-              </w:rPr>
               <w:t>4</w:t>
             </w:r>
             <w:r>
@@ -1248,34 +1200,28 @@
             </w:r>
             <w:r>
               <w:rPr>
+                <w:webHidden/>
+              </w:rPr>
+              <w:fldChar w:fldCharType="begin"/>
+            </w:r>
+            <w:r>
+              <w:rPr>
+                <w:webHidden/>
+              </w:rPr>
+              <w:instrText xml:space="preserve">PAGEREF _Toc218955539 \h</w:instrText>
+            </w:r>
+            <w:r>
+              <w:rPr>
+                <w:webHidden/>
+              </w:rPr>
+              <w:fldChar w:fldCharType="separate"/>
+            </w:r>
+            <w:r>
+              <w:rPr>
                 <w:rStyle w:val="IndexLink"/>
                 <w:vanish w:val="false"/>
               </w:rPr>
               <w:tab/>
-            </w:r>
-            <w:r>
-              <w:rPr>
-                <w:webHidden/>
-              </w:rPr>
-              <w:fldChar w:fldCharType="begin"/>
-            </w:r>
-            <w:r>
-              <w:rPr>
-                <w:webHidden/>
-              </w:rPr>
-              <w:instrText xml:space="preserve">PAGEREF _Toc218955539 \h</w:instrText>
-            </w:r>
-            <w:r>
-              <w:rPr>
-                <w:webHidden/>
-              </w:rPr>
-              <w:fldChar w:fldCharType="separate"/>
-            </w:r>
-            <w:r>
-              <w:rPr>
-                <w:rStyle w:val="IndexLink"/>
-                <w:vanish/>
-              </w:rPr>
               <w:t>4</w:t>
             </w:r>
             <w:r>
@@ -1315,34 +1261,28 @@
             </w:r>
             <w:r>
               <w:rPr>
+                <w:webHidden/>
+              </w:rPr>
+              <w:fldChar w:fldCharType="begin"/>
+            </w:r>
+            <w:r>
+              <w:rPr>
+                <w:webHidden/>
+              </w:rPr>
+              <w:instrText xml:space="preserve">PAGEREF _Toc218955540 \h</w:instrText>
+            </w:r>
+            <w:r>
+              <w:rPr>
+                <w:webHidden/>
+              </w:rPr>
+              <w:fldChar w:fldCharType="separate"/>
+            </w:r>
+            <w:r>
+              <w:rPr>
                 <w:rStyle w:val="IndexLink"/>
                 <w:vanish w:val="false"/>
               </w:rPr>
               <w:tab/>
-            </w:r>
-            <w:r>
-              <w:rPr>
-                <w:webHidden/>
-              </w:rPr>
-              <w:fldChar w:fldCharType="begin"/>
-            </w:r>
-            <w:r>
-              <w:rPr>
-                <w:webHidden/>
-              </w:rPr>
-              <w:instrText xml:space="preserve">PAGEREF _Toc218955540 \h</w:instrText>
-            </w:r>
-            <w:r>
-              <w:rPr>
-                <w:webHidden/>
-              </w:rPr>
-              <w:fldChar w:fldCharType="separate"/>
-            </w:r>
-            <w:r>
-              <w:rPr>
-                <w:rStyle w:val="IndexLink"/>
-                <w:vanish/>
-              </w:rPr>
               <w:t>5</w:t>
             </w:r>
             <w:r>
@@ -1397,34 +1337,28 @@
             </w:r>
             <w:r>
               <w:rPr>
+                <w:webHidden/>
+              </w:rPr>
+              <w:fldChar w:fldCharType="begin"/>
+            </w:r>
+            <w:r>
+              <w:rPr>
+                <w:webHidden/>
+              </w:rPr>
+              <w:instrText xml:space="preserve">PAGEREF _Toc218955541 \h</w:instrText>
+            </w:r>
+            <w:r>
+              <w:rPr>
+                <w:webHidden/>
+              </w:rPr>
+              <w:fldChar w:fldCharType="separate"/>
+            </w:r>
+            <w:r>
+              <w:rPr>
                 <w:rStyle w:val="IndexLink"/>
                 <w:vanish w:val="false"/>
               </w:rPr>
               <w:tab/>
-            </w:r>
-            <w:r>
-              <w:rPr>
-                <w:webHidden/>
-              </w:rPr>
-              <w:fldChar w:fldCharType="begin"/>
-            </w:r>
-            <w:r>
-              <w:rPr>
-                <w:webHidden/>
-              </w:rPr>
-              <w:instrText xml:space="preserve">PAGEREF _Toc218955541 \h</w:instrText>
-            </w:r>
-            <w:r>
-              <w:rPr>
-                <w:webHidden/>
-              </w:rPr>
-              <w:fldChar w:fldCharType="separate"/>
-            </w:r>
-            <w:r>
-              <w:rPr>
-                <w:rStyle w:val="IndexLink"/>
-                <w:vanish/>
-              </w:rPr>
               <w:t>5</w:t>
             </w:r>
             <w:r>
@@ -1463,34 +1397,28 @@
             </w:r>
             <w:r>
               <w:rPr>
+                <w:webHidden/>
+              </w:rPr>
+              <w:fldChar w:fldCharType="begin"/>
+            </w:r>
+            <w:r>
+              <w:rPr>
+                <w:webHidden/>
+              </w:rPr>
+              <w:instrText xml:space="preserve">PAGEREF _Toc218955542 \h</w:instrText>
+            </w:r>
+            <w:r>
+              <w:rPr>
+                <w:webHidden/>
+              </w:rPr>
+              <w:fldChar w:fldCharType="separate"/>
+            </w:r>
+            <w:r>
+              <w:rPr>
                 <w:rStyle w:val="IndexLink"/>
                 <w:vanish w:val="false"/>
               </w:rPr>
               <w:tab/>
-            </w:r>
-            <w:r>
-              <w:rPr>
-                <w:webHidden/>
-              </w:rPr>
-              <w:fldChar w:fldCharType="begin"/>
-            </w:r>
-            <w:r>
-              <w:rPr>
-                <w:webHidden/>
-              </w:rPr>
-              <w:instrText xml:space="preserve">PAGEREF _Toc218955542 \h</w:instrText>
-            </w:r>
-            <w:r>
-              <w:rPr>
-                <w:webHidden/>
-              </w:rPr>
-              <w:fldChar w:fldCharType="separate"/>
-            </w:r>
-            <w:r>
-              <w:rPr>
-                <w:rStyle w:val="IndexLink"/>
-                <w:vanish/>
-              </w:rPr>
               <w:t>6</w:t>
             </w:r>
             <w:r>
@@ -1545,34 +1473,28 @@
             </w:r>
             <w:r>
               <w:rPr>
+                <w:webHidden/>
+              </w:rPr>
+              <w:fldChar w:fldCharType="begin"/>
+            </w:r>
+            <w:r>
+              <w:rPr>
+                <w:webHidden/>
+              </w:rPr>
+              <w:instrText xml:space="preserve">PAGEREF _Toc218955543 \h</w:instrText>
+            </w:r>
+            <w:r>
+              <w:rPr>
+                <w:webHidden/>
+              </w:rPr>
+              <w:fldChar w:fldCharType="separate"/>
+            </w:r>
+            <w:r>
+              <w:rPr>
                 <w:rStyle w:val="IndexLink"/>
                 <w:vanish w:val="false"/>
               </w:rPr>
               <w:tab/>
-            </w:r>
-            <w:r>
-              <w:rPr>
-                <w:webHidden/>
-              </w:rPr>
-              <w:fldChar w:fldCharType="begin"/>
-            </w:r>
-            <w:r>
-              <w:rPr>
-                <w:webHidden/>
-              </w:rPr>
-              <w:instrText xml:space="preserve">PAGEREF _Toc218955543 \h</w:instrText>
-            </w:r>
-            <w:r>
-              <w:rPr>
-                <w:webHidden/>
-              </w:rPr>
-              <w:fldChar w:fldCharType="separate"/>
-            </w:r>
-            <w:r>
-              <w:rPr>
-                <w:rStyle w:val="IndexLink"/>
-                <w:vanish/>
-              </w:rPr>
               <w:t>7</w:t>
             </w:r>
             <w:r>
@@ -1634,34 +1556,28 @@
             </w:r>
             <w:r>
               <w:rPr>
+                <w:webHidden/>
+              </w:rPr>
+              <w:fldChar w:fldCharType="begin"/>
+            </w:r>
+            <w:r>
+              <w:rPr>
+                <w:webHidden/>
+              </w:rPr>
+              <w:instrText xml:space="preserve">PAGEREF _Toc218955544 \h</w:instrText>
+            </w:r>
+            <w:r>
+              <w:rPr>
+                <w:webHidden/>
+              </w:rPr>
+              <w:fldChar w:fldCharType="separate"/>
+            </w:r>
+            <w:r>
+              <w:rPr>
                 <w:rStyle w:val="IndexLink"/>
                 <w:vanish w:val="false"/>
               </w:rPr>
               <w:tab/>
-            </w:r>
-            <w:r>
-              <w:rPr>
-                <w:webHidden/>
-              </w:rPr>
-              <w:fldChar w:fldCharType="begin"/>
-            </w:r>
-            <w:r>
-              <w:rPr>
-                <w:webHidden/>
-              </w:rPr>
-              <w:instrText xml:space="preserve">PAGEREF _Toc218955544 \h</w:instrText>
-            </w:r>
-            <w:r>
-              <w:rPr>
-                <w:webHidden/>
-              </w:rPr>
-              <w:fldChar w:fldCharType="separate"/>
-            </w:r>
-            <w:r>
-              <w:rPr>
-                <w:rStyle w:val="IndexLink"/>
-                <w:vanish/>
-              </w:rPr>
               <w:t>7</w:t>
             </w:r>
             <w:r>
@@ -1701,34 +1617,28 @@
             </w:r>
             <w:r>
               <w:rPr>
+                <w:webHidden/>
+              </w:rPr>
+              <w:fldChar w:fldCharType="begin"/>
+            </w:r>
+            <w:r>
+              <w:rPr>
+                <w:webHidden/>
+              </w:rPr>
+              <w:instrText xml:space="preserve">PAGEREF _Toc218955545 \h</w:instrText>
+            </w:r>
+            <w:r>
+              <w:rPr>
+                <w:webHidden/>
+              </w:rPr>
+              <w:fldChar w:fldCharType="separate"/>
+            </w:r>
+            <w:r>
+              <w:rPr>
                 <w:rStyle w:val="IndexLink"/>
                 <w:vanish w:val="false"/>
               </w:rPr>
               <w:tab/>
-            </w:r>
-            <w:r>
-              <w:rPr>
-                <w:webHidden/>
-              </w:rPr>
-              <w:fldChar w:fldCharType="begin"/>
-            </w:r>
-            <w:r>
-              <w:rPr>
-                <w:webHidden/>
-              </w:rPr>
-              <w:instrText xml:space="preserve">PAGEREF _Toc218955545 \h</w:instrText>
-            </w:r>
-            <w:r>
-              <w:rPr>
-                <w:webHidden/>
-              </w:rPr>
-              <w:fldChar w:fldCharType="separate"/>
-            </w:r>
-            <w:r>
-              <w:rPr>
-                <w:rStyle w:val="IndexLink"/>
-                <w:vanish/>
-              </w:rPr>
               <w:t>29</w:t>
             </w:r>
             <w:r>
@@ -1768,34 +1678,28 @@
             </w:r>
             <w:r>
               <w:rPr>
+                <w:webHidden/>
+              </w:rPr>
+              <w:fldChar w:fldCharType="begin"/>
+            </w:r>
+            <w:r>
+              <w:rPr>
+                <w:webHidden/>
+              </w:rPr>
+              <w:instrText xml:space="preserve">PAGEREF _Toc218955546 \h</w:instrText>
+            </w:r>
+            <w:r>
+              <w:rPr>
+                <w:webHidden/>
+              </w:rPr>
+              <w:fldChar w:fldCharType="separate"/>
+            </w:r>
+            <w:r>
+              <w:rPr>
                 <w:rStyle w:val="IndexLink"/>
                 <w:vanish w:val="false"/>
               </w:rPr>
               <w:tab/>
-            </w:r>
-            <w:r>
-              <w:rPr>
-                <w:webHidden/>
-              </w:rPr>
-              <w:fldChar w:fldCharType="begin"/>
-            </w:r>
-            <w:r>
-              <w:rPr>
-                <w:webHidden/>
-              </w:rPr>
-              <w:instrText xml:space="preserve">PAGEREF _Toc218955546 \h</w:instrText>
-            </w:r>
-            <w:r>
-              <w:rPr>
-                <w:webHidden/>
-              </w:rPr>
-              <w:fldChar w:fldCharType="separate"/>
-            </w:r>
-            <w:r>
-              <w:rPr>
-                <w:rStyle w:val="IndexLink"/>
-                <w:vanish/>
-              </w:rPr>
               <w:t>29</w:t>
             </w:r>
             <w:r>
@@ -1834,34 +1738,28 @@
             </w:r>
             <w:r>
               <w:rPr>
+                <w:webHidden/>
+              </w:rPr>
+              <w:fldChar w:fldCharType="begin"/>
+            </w:r>
+            <w:r>
+              <w:rPr>
+                <w:webHidden/>
+              </w:rPr>
+              <w:instrText xml:space="preserve">PAGEREF _Toc218955547 \h</w:instrText>
+            </w:r>
+            <w:r>
+              <w:rPr>
+                <w:webHidden/>
+              </w:rPr>
+              <w:fldChar w:fldCharType="separate"/>
+            </w:r>
+            <w:r>
+              <w:rPr>
                 <w:rStyle w:val="IndexLink"/>
                 <w:vanish w:val="false"/>
               </w:rPr>
               <w:tab/>
-            </w:r>
-            <w:r>
-              <w:rPr>
-                <w:webHidden/>
-              </w:rPr>
-              <w:fldChar w:fldCharType="begin"/>
-            </w:r>
-            <w:r>
-              <w:rPr>
-                <w:webHidden/>
-              </w:rPr>
-              <w:instrText xml:space="preserve">PAGEREF _Toc218955547 \h</w:instrText>
-            </w:r>
-            <w:r>
-              <w:rPr>
-                <w:webHidden/>
-              </w:rPr>
-              <w:fldChar w:fldCharType="separate"/>
-            </w:r>
-            <w:r>
-              <w:rPr>
-                <w:rStyle w:val="IndexLink"/>
-                <w:vanish/>
-              </w:rPr>
               <w:t>30</w:t>
             </w:r>
             <w:r>
@@ -1891,36 +1789,30 @@
           <w:hyperlink w:anchor="_Toc218955548">
             <w:r>
               <w:rPr>
+                <w:webHidden/>
+              </w:rPr>
+              <w:fldChar w:fldCharType="begin"/>
+            </w:r>
+            <w:r>
+              <w:rPr>
+                <w:webHidden/>
+              </w:rPr>
+              <w:instrText xml:space="preserve">PAGEREF _Toc218955548 \h</w:instrText>
+            </w:r>
+            <w:r>
+              <w:rPr>
+                <w:webHidden/>
+              </w:rPr>
+              <w:fldChar w:fldCharType="separate"/>
+            </w:r>
+            <w:r>
+              <w:rPr>
                 <w:rStyle w:val="IndexLink"/>
                 <w:vanish w:val="false"/>
                 <w:webHidden/>
               </w:rPr>
               <w:t>4.5.3 Approver Behaviour</w:t>
               <w:tab/>
-            </w:r>
-            <w:r>
-              <w:rPr>
-                <w:webHidden/>
-              </w:rPr>
-              <w:fldChar w:fldCharType="begin"/>
-            </w:r>
-            <w:r>
-              <w:rPr>
-                <w:webHidden/>
-              </w:rPr>
-              <w:instrText xml:space="preserve">PAGEREF _Toc218955548 \h</w:instrText>
-            </w:r>
-            <w:r>
-              <w:rPr>
-                <w:webHidden/>
-              </w:rPr>
-              <w:fldChar w:fldCharType="separate"/>
-            </w:r>
-            <w:r>
-              <w:rPr>
-                <w:rStyle w:val="IndexLink"/>
-                <w:vanish/>
-              </w:rPr>
               <w:t>44</w:t>
             </w:r>
             <w:r>
@@ -1950,36 +1842,30 @@
           <w:hyperlink w:anchor="_Toc218955549">
             <w:r>
               <w:rPr>
+                <w:webHidden/>
+              </w:rPr>
+              <w:fldChar w:fldCharType="begin"/>
+            </w:r>
+            <w:r>
+              <w:rPr>
+                <w:webHidden/>
+              </w:rPr>
+              <w:instrText xml:space="preserve">PAGEREF _Toc218955549 \h</w:instrText>
+            </w:r>
+            <w:r>
+              <w:rPr>
+                <w:webHidden/>
+              </w:rPr>
+              <w:fldChar w:fldCharType="separate"/>
+            </w:r>
+            <w:r>
+              <w:rPr>
                 <w:rStyle w:val="IndexLink"/>
                 <w:vanish w:val="false"/>
                 <w:webHidden/>
               </w:rPr>
               <w:t>4.5.3.1 Approver Flow</w:t>
               <w:tab/>
-            </w:r>
-            <w:r>
-              <w:rPr>
-                <w:webHidden/>
-              </w:rPr>
-              <w:fldChar w:fldCharType="begin"/>
-            </w:r>
-            <w:r>
-              <w:rPr>
-                <w:webHidden/>
-              </w:rPr>
-              <w:instrText xml:space="preserve">PAGEREF _Toc218955549 \h</w:instrText>
-            </w:r>
-            <w:r>
-              <w:rPr>
-                <w:webHidden/>
-              </w:rPr>
-              <w:fldChar w:fldCharType="separate"/>
-            </w:r>
-            <w:r>
-              <w:rPr>
-                <w:rStyle w:val="IndexLink"/>
-                <w:vanish/>
-              </w:rPr>
               <w:t>45</w:t>
             </w:r>
             <w:r>
@@ -2019,34 +1905,28 @@
             </w:r>
             <w:r>
               <w:rPr>
+                <w:webHidden/>
+              </w:rPr>
+              <w:fldChar w:fldCharType="begin"/>
+            </w:r>
+            <w:r>
+              <w:rPr>
+                <w:webHidden/>
+              </w:rPr>
+              <w:instrText xml:space="preserve">PAGEREF _Toc218955550 \h</w:instrText>
+            </w:r>
+            <w:r>
+              <w:rPr>
+                <w:webHidden/>
+              </w:rPr>
+              <w:fldChar w:fldCharType="separate"/>
+            </w:r>
+            <w:r>
+              <w:rPr>
                 <w:rStyle w:val="IndexLink"/>
                 <w:vanish w:val="false"/>
               </w:rPr>
               <w:tab/>
-            </w:r>
-            <w:r>
-              <w:rPr>
-                <w:webHidden/>
-              </w:rPr>
-              <w:fldChar w:fldCharType="begin"/>
-            </w:r>
-            <w:r>
-              <w:rPr>
-                <w:webHidden/>
-              </w:rPr>
-              <w:instrText xml:space="preserve">PAGEREF _Toc218955550 \h</w:instrText>
-            </w:r>
-            <w:r>
-              <w:rPr>
-                <w:webHidden/>
-              </w:rPr>
-              <w:fldChar w:fldCharType="separate"/>
-            </w:r>
-            <w:r>
-              <w:rPr>
-                <w:rStyle w:val="IndexLink"/>
-                <w:vanish/>
-              </w:rPr>
               <w:t>46</w:t>
             </w:r>
             <w:r>
@@ -2086,34 +1966,28 @@
             </w:r>
             <w:r>
               <w:rPr>
+                <w:webHidden/>
+              </w:rPr>
+              <w:fldChar w:fldCharType="begin"/>
+            </w:r>
+            <w:r>
+              <w:rPr>
+                <w:webHidden/>
+              </w:rPr>
+              <w:instrText xml:space="preserve">PAGEREF _Toc218955551 \h</w:instrText>
+            </w:r>
+            <w:r>
+              <w:rPr>
+                <w:webHidden/>
+              </w:rPr>
+              <w:fldChar w:fldCharType="separate"/>
+            </w:r>
+            <w:r>
+              <w:rPr>
                 <w:rStyle w:val="IndexLink"/>
                 <w:vanish w:val="false"/>
               </w:rPr>
               <w:tab/>
-            </w:r>
-            <w:r>
-              <w:rPr>
-                <w:webHidden/>
-              </w:rPr>
-              <w:fldChar w:fldCharType="begin"/>
-            </w:r>
-            <w:r>
-              <w:rPr>
-                <w:webHidden/>
-              </w:rPr>
-              <w:instrText xml:space="preserve">PAGEREF _Toc218955551 \h</w:instrText>
-            </w:r>
-            <w:r>
-              <w:rPr>
-                <w:webHidden/>
-              </w:rPr>
-              <w:fldChar w:fldCharType="separate"/>
-            </w:r>
-            <w:r>
-              <w:rPr>
-                <w:rStyle w:val="IndexLink"/>
-                <w:vanish/>
-              </w:rPr>
               <w:t>50</w:t>
             </w:r>
             <w:r>
@@ -2153,34 +2027,28 @@
             </w:r>
             <w:r>
               <w:rPr>
+                <w:webHidden/>
+              </w:rPr>
+              <w:fldChar w:fldCharType="begin"/>
+            </w:r>
+            <w:r>
+              <w:rPr>
+                <w:webHidden/>
+              </w:rPr>
+              <w:instrText xml:space="preserve">PAGEREF _Toc218955552 \h</w:instrText>
+            </w:r>
+            <w:r>
+              <w:rPr>
+                <w:webHidden/>
+              </w:rPr>
+              <w:fldChar w:fldCharType="separate"/>
+            </w:r>
+            <w:r>
+              <w:rPr>
                 <w:rStyle w:val="IndexLink"/>
                 <w:vanish w:val="false"/>
               </w:rPr>
               <w:tab/>
-            </w:r>
-            <w:r>
-              <w:rPr>
-                <w:webHidden/>
-              </w:rPr>
-              <w:fldChar w:fldCharType="begin"/>
-            </w:r>
-            <w:r>
-              <w:rPr>
-                <w:webHidden/>
-              </w:rPr>
-              <w:instrText xml:space="preserve">PAGEREF _Toc218955552 \h</w:instrText>
-            </w:r>
-            <w:r>
-              <w:rPr>
-                <w:webHidden/>
-              </w:rPr>
-              <w:fldChar w:fldCharType="separate"/>
-            </w:r>
-            <w:r>
-              <w:rPr>
-                <w:rStyle w:val="IndexLink"/>
-                <w:vanish/>
-              </w:rPr>
               <w:t>51</w:t>
             </w:r>
             <w:r>
@@ -2220,34 +2088,28 @@
             </w:r>
             <w:r>
               <w:rPr>
+                <w:webHidden/>
+              </w:rPr>
+              <w:fldChar w:fldCharType="begin"/>
+            </w:r>
+            <w:r>
+              <w:rPr>
+                <w:webHidden/>
+              </w:rPr>
+              <w:instrText xml:space="preserve">PAGEREF _Toc218955553 \h</w:instrText>
+            </w:r>
+            <w:r>
+              <w:rPr>
+                <w:webHidden/>
+              </w:rPr>
+              <w:fldChar w:fldCharType="separate"/>
+            </w:r>
+            <w:r>
+              <w:rPr>
                 <w:rStyle w:val="IndexLink"/>
                 <w:vanish w:val="false"/>
               </w:rPr>
               <w:tab/>
-            </w:r>
-            <w:r>
-              <w:rPr>
-                <w:webHidden/>
-              </w:rPr>
-              <w:fldChar w:fldCharType="begin"/>
-            </w:r>
-            <w:r>
-              <w:rPr>
-                <w:webHidden/>
-              </w:rPr>
-              <w:instrText xml:space="preserve">PAGEREF _Toc218955553 \h</w:instrText>
-            </w:r>
-            <w:r>
-              <w:rPr>
-                <w:webHidden/>
-              </w:rPr>
-              <w:fldChar w:fldCharType="separate"/>
-            </w:r>
-            <w:r>
-              <w:rPr>
-                <w:rStyle w:val="IndexLink"/>
-                <w:vanish/>
-              </w:rPr>
               <w:t>51</w:t>
             </w:r>
             <w:r>
@@ -2287,34 +2149,28 @@
             </w:r>
             <w:r>
               <w:rPr>
+                <w:webHidden/>
+              </w:rPr>
+              <w:fldChar w:fldCharType="begin"/>
+            </w:r>
+            <w:r>
+              <w:rPr>
+                <w:webHidden/>
+              </w:rPr>
+              <w:instrText xml:space="preserve">PAGEREF _Toc218955554 \h</w:instrText>
+            </w:r>
+            <w:r>
+              <w:rPr>
+                <w:webHidden/>
+              </w:rPr>
+              <w:fldChar w:fldCharType="separate"/>
+            </w:r>
+            <w:r>
+              <w:rPr>
                 <w:rStyle w:val="IndexLink"/>
                 <w:vanish w:val="false"/>
               </w:rPr>
               <w:tab/>
-            </w:r>
-            <w:r>
-              <w:rPr>
-                <w:webHidden/>
-              </w:rPr>
-              <w:fldChar w:fldCharType="begin"/>
-            </w:r>
-            <w:r>
-              <w:rPr>
-                <w:webHidden/>
-              </w:rPr>
-              <w:instrText xml:space="preserve">PAGEREF _Toc218955554 \h</w:instrText>
-            </w:r>
-            <w:r>
-              <w:rPr>
-                <w:webHidden/>
-              </w:rPr>
-              <w:fldChar w:fldCharType="separate"/>
-            </w:r>
-            <w:r>
-              <w:rPr>
-                <w:rStyle w:val="IndexLink"/>
-                <w:vanish/>
-              </w:rPr>
               <w:t>51</w:t>
             </w:r>
             <w:r>
@@ -2354,34 +2210,28 @@
             </w:r>
             <w:r>
               <w:rPr>
+                <w:webHidden/>
+              </w:rPr>
+              <w:fldChar w:fldCharType="begin"/>
+            </w:r>
+            <w:r>
+              <w:rPr>
+                <w:webHidden/>
+              </w:rPr>
+              <w:instrText xml:space="preserve">PAGEREF _Toc218955555 \h</w:instrText>
+            </w:r>
+            <w:r>
+              <w:rPr>
+                <w:webHidden/>
+              </w:rPr>
+              <w:fldChar w:fldCharType="separate"/>
+            </w:r>
+            <w:r>
+              <w:rPr>
                 <w:rStyle w:val="IndexLink"/>
                 <w:vanish w:val="false"/>
               </w:rPr>
               <w:tab/>
-            </w:r>
-            <w:r>
-              <w:rPr>
-                <w:webHidden/>
-              </w:rPr>
-              <w:fldChar w:fldCharType="begin"/>
-            </w:r>
-            <w:r>
-              <w:rPr>
-                <w:webHidden/>
-              </w:rPr>
-              <w:instrText xml:space="preserve">PAGEREF _Toc218955555 \h</w:instrText>
-            </w:r>
-            <w:r>
-              <w:rPr>
-                <w:webHidden/>
-              </w:rPr>
-              <w:fldChar w:fldCharType="separate"/>
-            </w:r>
-            <w:r>
-              <w:rPr>
-                <w:rStyle w:val="IndexLink"/>
-                <w:vanish/>
-              </w:rPr>
               <w:t>51</w:t>
             </w:r>
             <w:r>
@@ -2421,34 +2271,28 @@
             </w:r>
             <w:r>
               <w:rPr>
+                <w:webHidden/>
+              </w:rPr>
+              <w:fldChar w:fldCharType="begin"/>
+            </w:r>
+            <w:r>
+              <w:rPr>
+                <w:webHidden/>
+              </w:rPr>
+              <w:instrText xml:space="preserve">PAGEREF _Toc218955556 \h</w:instrText>
+            </w:r>
+            <w:r>
+              <w:rPr>
+                <w:webHidden/>
+              </w:rPr>
+              <w:fldChar w:fldCharType="separate"/>
+            </w:r>
+            <w:r>
+              <w:rPr>
                 <w:rStyle w:val="IndexLink"/>
                 <w:vanish w:val="false"/>
               </w:rPr>
               <w:tab/>
-            </w:r>
-            <w:r>
-              <w:rPr>
-                <w:webHidden/>
-              </w:rPr>
-              <w:fldChar w:fldCharType="begin"/>
-            </w:r>
-            <w:r>
-              <w:rPr>
-                <w:webHidden/>
-              </w:rPr>
-              <w:instrText xml:space="preserve">PAGEREF _Toc218955556 \h</w:instrText>
-            </w:r>
-            <w:r>
-              <w:rPr>
-                <w:webHidden/>
-              </w:rPr>
-              <w:fldChar w:fldCharType="separate"/>
-            </w:r>
-            <w:r>
-              <w:rPr>
-                <w:rStyle w:val="IndexLink"/>
-                <w:vanish/>
-              </w:rPr>
               <w:t>53</w:t>
             </w:r>
             <w:r>
@@ -2488,34 +2332,28 @@
             </w:r>
             <w:r>
               <w:rPr>
+                <w:webHidden/>
+              </w:rPr>
+              <w:fldChar w:fldCharType="begin"/>
+            </w:r>
+            <w:r>
+              <w:rPr>
+                <w:webHidden/>
+              </w:rPr>
+              <w:instrText xml:space="preserve">PAGEREF _Toc218955557 \h</w:instrText>
+            </w:r>
+            <w:r>
+              <w:rPr>
+                <w:webHidden/>
+              </w:rPr>
+              <w:fldChar w:fldCharType="separate"/>
+            </w:r>
+            <w:r>
+              <w:rPr>
                 <w:rStyle w:val="IndexLink"/>
                 <w:vanish w:val="false"/>
               </w:rPr>
               <w:tab/>
-            </w:r>
-            <w:r>
-              <w:rPr>
-                <w:webHidden/>
-              </w:rPr>
-              <w:fldChar w:fldCharType="begin"/>
-            </w:r>
-            <w:r>
-              <w:rPr>
-                <w:webHidden/>
-              </w:rPr>
-              <w:instrText xml:space="preserve">PAGEREF _Toc218955557 \h</w:instrText>
-            </w:r>
-            <w:r>
-              <w:rPr>
-                <w:webHidden/>
-              </w:rPr>
-              <w:fldChar w:fldCharType="separate"/>
-            </w:r>
-            <w:r>
-              <w:rPr>
-                <w:rStyle w:val="IndexLink"/>
-                <w:vanish/>
-              </w:rPr>
               <w:t>53</w:t>
             </w:r>
             <w:r>
@@ -2555,34 +2393,28 @@
             </w:r>
             <w:r>
               <w:rPr>
+                <w:webHidden/>
+              </w:rPr>
+              <w:fldChar w:fldCharType="begin"/>
+            </w:r>
+            <w:r>
+              <w:rPr>
+                <w:webHidden/>
+              </w:rPr>
+              <w:instrText xml:space="preserve">PAGEREF _Toc218955558 \h</w:instrText>
+            </w:r>
+            <w:r>
+              <w:rPr>
+                <w:webHidden/>
+              </w:rPr>
+              <w:fldChar w:fldCharType="separate"/>
+            </w:r>
+            <w:r>
+              <w:rPr>
                 <w:rStyle w:val="IndexLink"/>
                 <w:vanish w:val="false"/>
               </w:rPr>
               <w:tab/>
-            </w:r>
-            <w:r>
-              <w:rPr>
-                <w:webHidden/>
-              </w:rPr>
-              <w:fldChar w:fldCharType="begin"/>
-            </w:r>
-            <w:r>
-              <w:rPr>
-                <w:webHidden/>
-              </w:rPr>
-              <w:instrText xml:space="preserve">PAGEREF _Toc218955558 \h</w:instrText>
-            </w:r>
-            <w:r>
-              <w:rPr>
-                <w:webHidden/>
-              </w:rPr>
-              <w:fldChar w:fldCharType="separate"/>
-            </w:r>
-            <w:r>
-              <w:rPr>
-                <w:rStyle w:val="IndexLink"/>
-                <w:vanish/>
-              </w:rPr>
               <w:t>53</w:t>
             </w:r>
             <w:r>
@@ -2622,34 +2454,28 @@
             </w:r>
             <w:r>
               <w:rPr>
+                <w:webHidden/>
+              </w:rPr>
+              <w:fldChar w:fldCharType="begin"/>
+            </w:r>
+            <w:r>
+              <w:rPr>
+                <w:webHidden/>
+              </w:rPr>
+              <w:instrText xml:space="preserve">PAGEREF _Toc218955559 \h</w:instrText>
+            </w:r>
+            <w:r>
+              <w:rPr>
+                <w:webHidden/>
+              </w:rPr>
+              <w:fldChar w:fldCharType="separate"/>
+            </w:r>
+            <w:r>
+              <w:rPr>
                 <w:rStyle w:val="IndexLink"/>
                 <w:vanish w:val="false"/>
               </w:rPr>
               <w:tab/>
-            </w:r>
-            <w:r>
-              <w:rPr>
-                <w:webHidden/>
-              </w:rPr>
-              <w:fldChar w:fldCharType="begin"/>
-            </w:r>
-            <w:r>
-              <w:rPr>
-                <w:webHidden/>
-              </w:rPr>
-              <w:instrText xml:space="preserve">PAGEREF _Toc218955559 \h</w:instrText>
-            </w:r>
-            <w:r>
-              <w:rPr>
-                <w:webHidden/>
-              </w:rPr>
-              <w:fldChar w:fldCharType="separate"/>
-            </w:r>
-            <w:r>
-              <w:rPr>
-                <w:rStyle w:val="IndexLink"/>
-                <w:vanish/>
-              </w:rPr>
               <w:t>53</w:t>
             </w:r>
             <w:r>
@@ -2689,34 +2515,28 @@
             </w:r>
             <w:r>
               <w:rPr>
+                <w:webHidden/>
+              </w:rPr>
+              <w:fldChar w:fldCharType="begin"/>
+            </w:r>
+            <w:r>
+              <w:rPr>
+                <w:webHidden/>
+              </w:rPr>
+              <w:instrText xml:space="preserve">PAGEREF _Toc218955560 \h</w:instrText>
+            </w:r>
+            <w:r>
+              <w:rPr>
+                <w:webHidden/>
+              </w:rPr>
+              <w:fldChar w:fldCharType="separate"/>
+            </w:r>
+            <w:r>
+              <w:rPr>
                 <w:rStyle w:val="IndexLink"/>
                 <w:vanish w:val="false"/>
               </w:rPr>
               <w:tab/>
-            </w:r>
-            <w:r>
-              <w:rPr>
-                <w:webHidden/>
-              </w:rPr>
-              <w:fldChar w:fldCharType="begin"/>
-            </w:r>
-            <w:r>
-              <w:rPr>
-                <w:webHidden/>
-              </w:rPr>
-              <w:instrText xml:space="preserve">PAGEREF _Toc218955560 \h</w:instrText>
-            </w:r>
-            <w:r>
-              <w:rPr>
-                <w:webHidden/>
-              </w:rPr>
-              <w:fldChar w:fldCharType="separate"/>
-            </w:r>
-            <w:r>
-              <w:rPr>
-                <w:rStyle w:val="IndexLink"/>
-                <w:vanish/>
-              </w:rPr>
               <w:t>53</w:t>
             </w:r>
             <w:r>
@@ -2756,34 +2576,28 @@
             </w:r>
             <w:r>
               <w:rPr>
+                <w:webHidden/>
+              </w:rPr>
+              <w:fldChar w:fldCharType="begin"/>
+            </w:r>
+            <w:r>
+              <w:rPr>
+                <w:webHidden/>
+              </w:rPr>
+              <w:instrText xml:space="preserve">PAGEREF _Toc218955561 \h</w:instrText>
+            </w:r>
+            <w:r>
+              <w:rPr>
+                <w:webHidden/>
+              </w:rPr>
+              <w:fldChar w:fldCharType="separate"/>
+            </w:r>
+            <w:r>
+              <w:rPr>
                 <w:rStyle w:val="IndexLink"/>
                 <w:vanish w:val="false"/>
               </w:rPr>
               <w:tab/>
-            </w:r>
-            <w:r>
-              <w:rPr>
-                <w:webHidden/>
-              </w:rPr>
-              <w:fldChar w:fldCharType="begin"/>
-            </w:r>
-            <w:r>
-              <w:rPr>
-                <w:webHidden/>
-              </w:rPr>
-              <w:instrText xml:space="preserve">PAGEREF _Toc218955561 \h</w:instrText>
-            </w:r>
-            <w:r>
-              <w:rPr>
-                <w:webHidden/>
-              </w:rPr>
-              <w:fldChar w:fldCharType="separate"/>
-            </w:r>
-            <w:r>
-              <w:rPr>
-                <w:rStyle w:val="IndexLink"/>
-                <w:vanish/>
-              </w:rPr>
               <w:t>54</w:t>
             </w:r>
             <w:r>
@@ -2823,34 +2637,28 @@
             </w:r>
             <w:r>
               <w:rPr>
+                <w:webHidden/>
+              </w:rPr>
+              <w:fldChar w:fldCharType="begin"/>
+            </w:r>
+            <w:r>
+              <w:rPr>
+                <w:webHidden/>
+              </w:rPr>
+              <w:instrText xml:space="preserve">PAGEREF _Toc218955562 \h</w:instrText>
+            </w:r>
+            <w:r>
+              <w:rPr>
+                <w:webHidden/>
+              </w:rPr>
+              <w:fldChar w:fldCharType="separate"/>
+            </w:r>
+            <w:r>
+              <w:rPr>
                 <w:rStyle w:val="IndexLink"/>
                 <w:vanish w:val="false"/>
               </w:rPr>
               <w:tab/>
-            </w:r>
-            <w:r>
-              <w:rPr>
-                <w:webHidden/>
-              </w:rPr>
-              <w:fldChar w:fldCharType="begin"/>
-            </w:r>
-            <w:r>
-              <w:rPr>
-                <w:webHidden/>
-              </w:rPr>
-              <w:instrText xml:space="preserve">PAGEREF _Toc218955562 \h</w:instrText>
-            </w:r>
-            <w:r>
-              <w:rPr>
-                <w:webHidden/>
-              </w:rPr>
-              <w:fldChar w:fldCharType="separate"/>
-            </w:r>
-            <w:r>
-              <w:rPr>
-                <w:rStyle w:val="IndexLink"/>
-                <w:vanish/>
-              </w:rPr>
               <w:t>54</w:t>
             </w:r>
             <w:r>
@@ -2890,34 +2698,28 @@
             </w:r>
             <w:r>
               <w:rPr>
+                <w:webHidden/>
+              </w:rPr>
+              <w:fldChar w:fldCharType="begin"/>
+            </w:r>
+            <w:r>
+              <w:rPr>
+                <w:webHidden/>
+              </w:rPr>
+              <w:instrText xml:space="preserve">PAGEREF _Toc218955563 \h</w:instrText>
+            </w:r>
+            <w:r>
+              <w:rPr>
+                <w:webHidden/>
+              </w:rPr>
+              <w:fldChar w:fldCharType="separate"/>
+            </w:r>
+            <w:r>
+              <w:rPr>
                 <w:rStyle w:val="IndexLink"/>
                 <w:vanish w:val="false"/>
               </w:rPr>
               <w:tab/>
-            </w:r>
-            <w:r>
-              <w:rPr>
-                <w:webHidden/>
-              </w:rPr>
-              <w:fldChar w:fldCharType="begin"/>
-            </w:r>
-            <w:r>
-              <w:rPr>
-                <w:webHidden/>
-              </w:rPr>
-              <w:instrText xml:space="preserve">PAGEREF _Toc218955563 \h</w:instrText>
-            </w:r>
-            <w:r>
-              <w:rPr>
-                <w:webHidden/>
-              </w:rPr>
-              <w:fldChar w:fldCharType="separate"/>
-            </w:r>
-            <w:r>
-              <w:rPr>
-                <w:rStyle w:val="IndexLink"/>
-                <w:vanish/>
-              </w:rPr>
               <w:t>54</w:t>
             </w:r>
             <w:r>
@@ -2957,34 +2759,28 @@
             </w:r>
             <w:r>
               <w:rPr>
+                <w:webHidden/>
+              </w:rPr>
+              <w:fldChar w:fldCharType="begin"/>
+            </w:r>
+            <w:r>
+              <w:rPr>
+                <w:webHidden/>
+              </w:rPr>
+              <w:instrText xml:space="preserve">PAGEREF _Toc218955564 \h</w:instrText>
+            </w:r>
+            <w:r>
+              <w:rPr>
+                <w:webHidden/>
+              </w:rPr>
+              <w:fldChar w:fldCharType="separate"/>
+            </w:r>
+            <w:r>
+              <w:rPr>
                 <w:rStyle w:val="IndexLink"/>
                 <w:vanish w:val="false"/>
               </w:rPr>
               <w:tab/>
-            </w:r>
-            <w:r>
-              <w:rPr>
-                <w:webHidden/>
-              </w:rPr>
-              <w:fldChar w:fldCharType="begin"/>
-            </w:r>
-            <w:r>
-              <w:rPr>
-                <w:webHidden/>
-              </w:rPr>
-              <w:instrText xml:space="preserve">PAGEREF _Toc218955564 \h</w:instrText>
-            </w:r>
-            <w:r>
-              <w:rPr>
-                <w:webHidden/>
-              </w:rPr>
-              <w:fldChar w:fldCharType="separate"/>
-            </w:r>
-            <w:r>
-              <w:rPr>
-                <w:rStyle w:val="IndexLink"/>
-                <w:vanish/>
-              </w:rPr>
               <w:t>54</w:t>
             </w:r>
             <w:r>
@@ -3024,34 +2820,28 @@
             </w:r>
             <w:r>
               <w:rPr>
+                <w:webHidden/>
+              </w:rPr>
+              <w:fldChar w:fldCharType="begin"/>
+            </w:r>
+            <w:r>
+              <w:rPr>
+                <w:webHidden/>
+              </w:rPr>
+              <w:instrText xml:space="preserve">PAGEREF _Toc218955565 \h</w:instrText>
+            </w:r>
+            <w:r>
+              <w:rPr>
+                <w:webHidden/>
+              </w:rPr>
+              <w:fldChar w:fldCharType="separate"/>
+            </w:r>
+            <w:r>
+              <w:rPr>
                 <w:rStyle w:val="IndexLink"/>
                 <w:vanish w:val="false"/>
               </w:rPr>
               <w:tab/>
-            </w:r>
-            <w:r>
-              <w:rPr>
-                <w:webHidden/>
-              </w:rPr>
-              <w:fldChar w:fldCharType="begin"/>
-            </w:r>
-            <w:r>
-              <w:rPr>
-                <w:webHidden/>
-              </w:rPr>
-              <w:instrText xml:space="preserve">PAGEREF _Toc218955565 \h</w:instrText>
-            </w:r>
-            <w:r>
-              <w:rPr>
-                <w:webHidden/>
-              </w:rPr>
-              <w:fldChar w:fldCharType="separate"/>
-            </w:r>
-            <w:r>
-              <w:rPr>
-                <w:rStyle w:val="IndexLink"/>
-                <w:vanish/>
-              </w:rPr>
               <w:t>55</w:t>
             </w:r>
             <w:r>
@@ -3064,7 +2854,7 @@
           <w:r>
             <w:rPr>
               <w:rStyle w:val="IndexLink"/>
-              <w:vanish/>
+              <w:vanish w:val="false"/>
             </w:rPr>
             <w:fldChar w:fldCharType="end"/>
           </w:r>
@@ -5019,9 +4809,9 @@
     </w:p>
     <w:tbl>
       <w:tblPr>
-        <w:tblW w:w="10522" w:type="dxa"/>
+        <w:tblW w:w="10408" w:type="dxa"/>
         <w:jc w:val="start"/>
-        <w:tblInd w:w="-67" w:type="dxa"/>
+        <w:tblInd w:w="46" w:type="dxa"/>
         <w:tblLayout w:type="fixed"/>
         <w:tblCellMar>
           <w:top w:w="0" w:type="dxa"/>
@@ -5032,10 +4822,10 @@
         <w:tblLook w:val="04a0" w:noHBand="0" w:noVBand="1" w:firstColumn="1" w:lastRow="0" w:lastColumn="0" w:firstRow="1"/>
       </w:tblPr>
       <w:tblGrid>
-        <w:gridCol w:w="3176"/>
-        <w:gridCol w:w="1846"/>
-        <w:gridCol w:w="1334"/>
-        <w:gridCol w:w="4166"/>
+        <w:gridCol w:w="3057"/>
+        <w:gridCol w:w="1857"/>
+        <w:gridCol w:w="1326"/>
+        <w:gridCol w:w="4168"/>
       </w:tblGrid>
       <w:tr>
         <w:trPr>
@@ -5043,7 +4833,7 @@
         </w:trPr>
         <w:tc>
           <w:tcPr>
-            <w:tcW w:w="3176" w:type="dxa"/>
+            <w:tcW w:w="3057" w:type="dxa"/>
             <w:tcBorders>
               <w:top w:val="single" w:sz="4" w:space="0" w:color="000000"/>
               <w:start w:val="single" w:sz="4" w:space="0" w:color="000000"/>
@@ -5084,7 +4874,7 @@
         </w:tc>
         <w:tc>
           <w:tcPr>
-            <w:tcW w:w="1846" w:type="dxa"/>
+            <w:tcW w:w="1857" w:type="dxa"/>
             <w:tcBorders>
               <w:top w:val="single" w:sz="4" w:space="0" w:color="000000"/>
               <w:bottom w:val="single" w:sz="4" w:space="0" w:color="000000"/>
@@ -5124,7 +4914,7 @@
         </w:tc>
         <w:tc>
           <w:tcPr>
-            <w:tcW w:w="1334" w:type="dxa"/>
+            <w:tcW w:w="1326" w:type="dxa"/>
             <w:tcBorders>
               <w:top w:val="single" w:sz="4" w:space="0" w:color="000000"/>
               <w:bottom w:val="single" w:sz="4" w:space="0" w:color="000000"/>
@@ -5164,7 +4954,7 @@
         </w:tc>
         <w:tc>
           <w:tcPr>
-            <w:tcW w:w="4166" w:type="dxa"/>
+            <w:tcW w:w="4168" w:type="dxa"/>
             <w:tcBorders>
               <w:top w:val="single" w:sz="4" w:space="0" w:color="000000"/>
               <w:bottom w:val="single" w:sz="4" w:space="0" w:color="000000"/>
@@ -5209,7 +4999,7 @@
         </w:trPr>
         <w:tc>
           <w:tcPr>
-            <w:tcW w:w="3176" w:type="dxa"/>
+            <w:tcW w:w="3057" w:type="dxa"/>
             <w:tcBorders>
               <w:start w:val="single" w:sz="4" w:space="0" w:color="000000"/>
               <w:bottom w:val="single" w:sz="4" w:space="0" w:color="000000"/>
@@ -5245,7 +5035,7 @@
         </w:tc>
         <w:tc>
           <w:tcPr>
-            <w:tcW w:w="1846" w:type="dxa"/>
+            <w:tcW w:w="1857" w:type="dxa"/>
             <w:tcBorders>
               <w:bottom w:val="single" w:sz="4" w:space="0" w:color="000000"/>
               <w:end w:val="single" w:sz="4" w:space="0" w:color="000000"/>
@@ -5280,7 +5070,7 @@
         </w:tc>
         <w:tc>
           <w:tcPr>
-            <w:tcW w:w="1334" w:type="dxa"/>
+            <w:tcW w:w="1326" w:type="dxa"/>
             <w:tcBorders>
               <w:bottom w:val="single" w:sz="4" w:space="0" w:color="000000"/>
               <w:end w:val="single" w:sz="4" w:space="0" w:color="000000"/>
@@ -5315,7 +5105,7 @@
         </w:tc>
         <w:tc>
           <w:tcPr>
-            <w:tcW w:w="4166" w:type="dxa"/>
+            <w:tcW w:w="4168" w:type="dxa"/>
             <w:tcBorders>
               <w:bottom w:val="single" w:sz="4" w:space="0" w:color="000000"/>
               <w:end w:val="single" w:sz="4" w:space="0" w:color="000000"/>
@@ -5355,7 +5145,7 @@
         </w:trPr>
         <w:tc>
           <w:tcPr>
-            <w:tcW w:w="3176" w:type="dxa"/>
+            <w:tcW w:w="3057" w:type="dxa"/>
             <w:tcBorders>
               <w:start w:val="single" w:sz="4" w:space="0" w:color="000000"/>
               <w:bottom w:val="single" w:sz="4" w:space="0" w:color="000000"/>
@@ -5391,7 +5181,7 @@
         </w:tc>
         <w:tc>
           <w:tcPr>
-            <w:tcW w:w="1846" w:type="dxa"/>
+            <w:tcW w:w="1857" w:type="dxa"/>
             <w:tcBorders>
               <w:bottom w:val="single" w:sz="4" w:space="0" w:color="000000"/>
               <w:end w:val="single" w:sz="4" w:space="0" w:color="000000"/>
@@ -5426,7 +5216,7 @@
         </w:tc>
         <w:tc>
           <w:tcPr>
-            <w:tcW w:w="1334" w:type="dxa"/>
+            <w:tcW w:w="1326" w:type="dxa"/>
             <w:tcBorders>
               <w:bottom w:val="single" w:sz="4" w:space="0" w:color="000000"/>
               <w:end w:val="single" w:sz="4" w:space="0" w:color="000000"/>
@@ -5461,7 +5251,7 @@
         </w:tc>
         <w:tc>
           <w:tcPr>
-            <w:tcW w:w="4166" w:type="dxa"/>
+            <w:tcW w:w="4168" w:type="dxa"/>
             <w:tcBorders>
               <w:bottom w:val="single" w:sz="4" w:space="0" w:color="000000"/>
               <w:end w:val="single" w:sz="4" w:space="0" w:color="000000"/>
@@ -5506,7 +5296,7 @@
         </w:trPr>
         <w:tc>
           <w:tcPr>
-            <w:tcW w:w="3176" w:type="dxa"/>
+            <w:tcW w:w="3057" w:type="dxa"/>
             <w:tcBorders>
               <w:start w:val="single" w:sz="4" w:space="0" w:color="000000"/>
               <w:bottom w:val="single" w:sz="4" w:space="0" w:color="000000"/>
@@ -5542,7 +5332,7 @@
         </w:tc>
         <w:tc>
           <w:tcPr>
-            <w:tcW w:w="1846" w:type="dxa"/>
+            <w:tcW w:w="1857" w:type="dxa"/>
             <w:tcBorders>
               <w:bottom w:val="single" w:sz="4" w:space="0" w:color="000000"/>
               <w:end w:val="single" w:sz="4" w:space="0" w:color="000000"/>
@@ -5574,7 +5364,7 @@
         </w:tc>
         <w:tc>
           <w:tcPr>
-            <w:tcW w:w="1334" w:type="dxa"/>
+            <w:tcW w:w="1326" w:type="dxa"/>
             <w:tcBorders>
               <w:bottom w:val="single" w:sz="4" w:space="0" w:color="000000"/>
               <w:end w:val="single" w:sz="4" w:space="0" w:color="000000"/>
@@ -5609,7 +5399,7 @@
         </w:tc>
         <w:tc>
           <w:tcPr>
-            <w:tcW w:w="4166" w:type="dxa"/>
+            <w:tcW w:w="4168" w:type="dxa"/>
             <w:tcBorders>
               <w:bottom w:val="single" w:sz="4" w:space="0" w:color="000000"/>
               <w:end w:val="single" w:sz="4" w:space="0" w:color="000000"/>
@@ -5649,7 +5439,7 @@
         </w:trPr>
         <w:tc>
           <w:tcPr>
-            <w:tcW w:w="3176" w:type="dxa"/>
+            <w:tcW w:w="3057" w:type="dxa"/>
             <w:tcBorders>
               <w:start w:val="single" w:sz="4" w:space="0" w:color="000000"/>
               <w:bottom w:val="single" w:sz="4" w:space="0" w:color="000000"/>
@@ -5685,7 +5475,7 @@
         </w:tc>
         <w:tc>
           <w:tcPr>
-            <w:tcW w:w="1846" w:type="dxa"/>
+            <w:tcW w:w="1857" w:type="dxa"/>
             <w:tcBorders>
               <w:bottom w:val="single" w:sz="4" w:space="0" w:color="000000"/>
               <w:end w:val="single" w:sz="4" w:space="0" w:color="000000"/>
@@ -5720,7 +5510,7 @@
         </w:tc>
         <w:tc>
           <w:tcPr>
-            <w:tcW w:w="1334" w:type="dxa"/>
+            <w:tcW w:w="1326" w:type="dxa"/>
             <w:tcBorders>
               <w:bottom w:val="single" w:sz="4" w:space="0" w:color="000000"/>
               <w:end w:val="single" w:sz="4" w:space="0" w:color="000000"/>
@@ -5755,7 +5545,7 @@
         </w:tc>
         <w:tc>
           <w:tcPr>
-            <w:tcW w:w="4166" w:type="dxa"/>
+            <w:tcW w:w="4168" w:type="dxa"/>
             <w:tcBorders>
               <w:bottom w:val="single" w:sz="4" w:space="0" w:color="000000"/>
               <w:end w:val="single" w:sz="4" w:space="0" w:color="000000"/>
@@ -5795,7 +5585,7 @@
         </w:trPr>
         <w:tc>
           <w:tcPr>
-            <w:tcW w:w="3176" w:type="dxa"/>
+            <w:tcW w:w="3057" w:type="dxa"/>
             <w:tcBorders>
               <w:start w:val="single" w:sz="4" w:space="0" w:color="000000"/>
               <w:bottom w:val="single" w:sz="4" w:space="0" w:color="000000"/>
@@ -5831,7 +5621,7 @@
         </w:tc>
         <w:tc>
           <w:tcPr>
-            <w:tcW w:w="1846" w:type="dxa"/>
+            <w:tcW w:w="1857" w:type="dxa"/>
             <w:tcBorders>
               <w:bottom w:val="single" w:sz="4" w:space="0" w:color="000000"/>
               <w:end w:val="single" w:sz="4" w:space="0" w:color="000000"/>
@@ -5866,7 +5656,7 @@
         </w:tc>
         <w:tc>
           <w:tcPr>
-            <w:tcW w:w="1334" w:type="dxa"/>
+            <w:tcW w:w="1326" w:type="dxa"/>
             <w:tcBorders>
               <w:bottom w:val="single" w:sz="4" w:space="0" w:color="000000"/>
               <w:end w:val="single" w:sz="4" w:space="0" w:color="000000"/>
@@ -5901,7 +5691,7 @@
         </w:tc>
         <w:tc>
           <w:tcPr>
-            <w:tcW w:w="4166" w:type="dxa"/>
+            <w:tcW w:w="4168" w:type="dxa"/>
             <w:tcBorders>
               <w:bottom w:val="single" w:sz="4" w:space="0" w:color="000000"/>
               <w:end w:val="single" w:sz="4" w:space="0" w:color="000000"/>
@@ -5983,7 +5773,7 @@
         </w:trPr>
         <w:tc>
           <w:tcPr>
-            <w:tcW w:w="3176" w:type="dxa"/>
+            <w:tcW w:w="3057" w:type="dxa"/>
             <w:tcBorders>
               <w:start w:val="single" w:sz="4" w:space="0" w:color="000000"/>
               <w:bottom w:val="single" w:sz="4" w:space="0" w:color="000000"/>
@@ -6019,7 +5809,7 @@
         </w:tc>
         <w:tc>
           <w:tcPr>
-            <w:tcW w:w="1846" w:type="dxa"/>
+            <w:tcW w:w="1857" w:type="dxa"/>
             <w:tcBorders>
               <w:bottom w:val="single" w:sz="4" w:space="0" w:color="000000"/>
               <w:end w:val="single" w:sz="4" w:space="0" w:color="000000"/>
@@ -6054,7 +5844,7 @@
         </w:tc>
         <w:tc>
           <w:tcPr>
-            <w:tcW w:w="1334" w:type="dxa"/>
+            <w:tcW w:w="1326" w:type="dxa"/>
             <w:tcBorders>
               <w:bottom w:val="single" w:sz="4" w:space="0" w:color="000000"/>
               <w:end w:val="single" w:sz="4" w:space="0" w:color="000000"/>
@@ -6089,7 +5879,7 @@
         </w:tc>
         <w:tc>
           <w:tcPr>
-            <w:tcW w:w="4166" w:type="dxa"/>
+            <w:tcW w:w="4168" w:type="dxa"/>
             <w:tcBorders>
               <w:bottom w:val="single" w:sz="4" w:space="0" w:color="000000"/>
               <w:end w:val="single" w:sz="4" w:space="0" w:color="000000"/>
@@ -6129,7 +5919,7 @@
         </w:trPr>
         <w:tc>
           <w:tcPr>
-            <w:tcW w:w="3176" w:type="dxa"/>
+            <w:tcW w:w="3057" w:type="dxa"/>
             <w:tcBorders>
               <w:start w:val="single" w:sz="4" w:space="0" w:color="000000"/>
               <w:bottom w:val="single" w:sz="4" w:space="0" w:color="000000"/>
@@ -6165,7 +5955,7 @@
         </w:tc>
         <w:tc>
           <w:tcPr>
-            <w:tcW w:w="1846" w:type="dxa"/>
+            <w:tcW w:w="1857" w:type="dxa"/>
             <w:tcBorders>
               <w:bottom w:val="single" w:sz="4" w:space="0" w:color="000000"/>
               <w:end w:val="single" w:sz="4" w:space="0" w:color="000000"/>
@@ -6200,7 +5990,7 @@
         </w:tc>
         <w:tc>
           <w:tcPr>
-            <w:tcW w:w="1334" w:type="dxa"/>
+            <w:tcW w:w="1326" w:type="dxa"/>
             <w:tcBorders>
               <w:bottom w:val="single" w:sz="4" w:space="0" w:color="000000"/>
               <w:end w:val="single" w:sz="4" w:space="0" w:color="000000"/>
@@ -6235,7 +6025,7 @@
         </w:tc>
         <w:tc>
           <w:tcPr>
-            <w:tcW w:w="4166" w:type="dxa"/>
+            <w:tcW w:w="4168" w:type="dxa"/>
             <w:tcBorders>
               <w:bottom w:val="single" w:sz="4" w:space="0" w:color="000000"/>
               <w:end w:val="single" w:sz="4" w:space="0" w:color="000000"/>
@@ -6272,7 +6062,7 @@
         </w:trPr>
         <w:tc>
           <w:tcPr>
-            <w:tcW w:w="3176" w:type="dxa"/>
+            <w:tcW w:w="3057" w:type="dxa"/>
             <w:tcBorders>
               <w:start w:val="single" w:sz="4" w:space="0" w:color="000000"/>
               <w:bottom w:val="single" w:sz="4" w:space="0" w:color="000000"/>
@@ -6308,7 +6098,7 @@
         </w:tc>
         <w:tc>
           <w:tcPr>
-            <w:tcW w:w="1846" w:type="dxa"/>
+            <w:tcW w:w="1857" w:type="dxa"/>
             <w:tcBorders>
               <w:bottom w:val="single" w:sz="4" w:space="0" w:color="000000"/>
               <w:end w:val="single" w:sz="4" w:space="0" w:color="000000"/>
@@ -6343,7 +6133,7 @@
         </w:tc>
         <w:tc>
           <w:tcPr>
-            <w:tcW w:w="1334" w:type="dxa"/>
+            <w:tcW w:w="1326" w:type="dxa"/>
             <w:tcBorders>
               <w:bottom w:val="single" w:sz="4" w:space="0" w:color="000000"/>
               <w:end w:val="single" w:sz="4" w:space="0" w:color="000000"/>
@@ -6378,7 +6168,7 @@
         </w:tc>
         <w:tc>
           <w:tcPr>
-            <w:tcW w:w="4166" w:type="dxa"/>
+            <w:tcW w:w="4168" w:type="dxa"/>
             <w:tcBorders>
               <w:bottom w:val="single" w:sz="4" w:space="0" w:color="000000"/>
               <w:end w:val="single" w:sz="4" w:space="0" w:color="000000"/>
@@ -6418,7 +6208,7 @@
         </w:trPr>
         <w:tc>
           <w:tcPr>
-            <w:tcW w:w="3176" w:type="dxa"/>
+            <w:tcW w:w="3057" w:type="dxa"/>
             <w:tcBorders>
               <w:start w:val="single" w:sz="4" w:space="0" w:color="000000"/>
               <w:bottom w:val="single" w:sz="4" w:space="0" w:color="000000"/>
@@ -6454,7 +6244,7 @@
         </w:tc>
         <w:tc>
           <w:tcPr>
-            <w:tcW w:w="1846" w:type="dxa"/>
+            <w:tcW w:w="1857" w:type="dxa"/>
             <w:tcBorders>
               <w:bottom w:val="single" w:sz="4" w:space="0" w:color="000000"/>
               <w:end w:val="single" w:sz="4" w:space="0" w:color="000000"/>
@@ -6489,7 +6279,7 @@
         </w:tc>
         <w:tc>
           <w:tcPr>
-            <w:tcW w:w="1334" w:type="dxa"/>
+            <w:tcW w:w="1326" w:type="dxa"/>
             <w:tcBorders>
               <w:bottom w:val="single" w:sz="4" w:space="0" w:color="000000"/>
               <w:end w:val="single" w:sz="4" w:space="0" w:color="000000"/>
@@ -6524,7 +6314,7 @@
         </w:tc>
         <w:tc>
           <w:tcPr>
-            <w:tcW w:w="4166" w:type="dxa"/>
+            <w:tcW w:w="4168" w:type="dxa"/>
             <w:tcBorders>
               <w:bottom w:val="single" w:sz="4" w:space="0" w:color="000000"/>
               <w:end w:val="single" w:sz="4" w:space="0" w:color="000000"/>
@@ -6564,7 +6354,7 @@
         </w:trPr>
         <w:tc>
           <w:tcPr>
-            <w:tcW w:w="3176" w:type="dxa"/>
+            <w:tcW w:w="3057" w:type="dxa"/>
             <w:tcBorders>
               <w:start w:val="single" w:sz="4" w:space="0" w:color="000000"/>
               <w:bottom w:val="single" w:sz="4" w:space="0" w:color="000000"/>
@@ -6600,7 +6390,7 @@
         </w:tc>
         <w:tc>
           <w:tcPr>
-            <w:tcW w:w="1846" w:type="dxa"/>
+            <w:tcW w:w="1857" w:type="dxa"/>
             <w:tcBorders>
               <w:bottom w:val="single" w:sz="4" w:space="0" w:color="000000"/>
               <w:end w:val="single" w:sz="4" w:space="0" w:color="000000"/>
@@ -6635,7 +6425,7 @@
         </w:tc>
         <w:tc>
           <w:tcPr>
-            <w:tcW w:w="1334" w:type="dxa"/>
+            <w:tcW w:w="1326" w:type="dxa"/>
             <w:tcBorders>
               <w:bottom w:val="single" w:sz="4" w:space="0" w:color="000000"/>
               <w:end w:val="single" w:sz="4" w:space="0" w:color="000000"/>
@@ -6670,7 +6460,7 @@
         </w:tc>
         <w:tc>
           <w:tcPr>
-            <w:tcW w:w="4166" w:type="dxa"/>
+            <w:tcW w:w="4168" w:type="dxa"/>
             <w:tcBorders>
               <w:bottom w:val="single" w:sz="4" w:space="0" w:color="000000"/>
               <w:end w:val="single" w:sz="4" w:space="0" w:color="000000"/>
@@ -6707,7 +6497,7 @@
         </w:trPr>
         <w:tc>
           <w:tcPr>
-            <w:tcW w:w="3176" w:type="dxa"/>
+            <w:tcW w:w="3057" w:type="dxa"/>
             <w:tcBorders>
               <w:start w:val="single" w:sz="4" w:space="0" w:color="000000"/>
               <w:bottom w:val="single" w:sz="4" w:space="0" w:color="000000"/>
@@ -6743,7 +6533,7 @@
         </w:tc>
         <w:tc>
           <w:tcPr>
-            <w:tcW w:w="1846" w:type="dxa"/>
+            <w:tcW w:w="1857" w:type="dxa"/>
             <w:tcBorders>
               <w:bottom w:val="single" w:sz="4" w:space="0" w:color="000000"/>
               <w:end w:val="single" w:sz="4" w:space="0" w:color="000000"/>
@@ -6778,7 +6568,7 @@
         </w:tc>
         <w:tc>
           <w:tcPr>
-            <w:tcW w:w="1334" w:type="dxa"/>
+            <w:tcW w:w="1326" w:type="dxa"/>
             <w:tcBorders>
               <w:bottom w:val="single" w:sz="4" w:space="0" w:color="000000"/>
               <w:end w:val="single" w:sz="4" w:space="0" w:color="000000"/>
@@ -6813,7 +6603,7 @@
         </w:tc>
         <w:tc>
           <w:tcPr>
-            <w:tcW w:w="4166" w:type="dxa"/>
+            <w:tcW w:w="4168" w:type="dxa"/>
             <w:tcBorders>
               <w:bottom w:val="single" w:sz="4" w:space="0" w:color="000000"/>
               <w:end w:val="single" w:sz="4" w:space="0" w:color="000000"/>
@@ -6853,7 +6643,7 @@
         </w:trPr>
         <w:tc>
           <w:tcPr>
-            <w:tcW w:w="3176" w:type="dxa"/>
+            <w:tcW w:w="3057" w:type="dxa"/>
             <w:tcBorders>
               <w:start w:val="single" w:sz="4" w:space="0" w:color="000000"/>
               <w:bottom w:val="single" w:sz="4" w:space="0" w:color="000000"/>
@@ -6889,7 +6679,7 @@
         </w:tc>
         <w:tc>
           <w:tcPr>
-            <w:tcW w:w="1846" w:type="dxa"/>
+            <w:tcW w:w="1857" w:type="dxa"/>
             <w:tcBorders>
               <w:bottom w:val="single" w:sz="4" w:space="0" w:color="000000"/>
               <w:end w:val="single" w:sz="4" w:space="0" w:color="000000"/>
@@ -6924,7 +6714,7 @@
         </w:tc>
         <w:tc>
           <w:tcPr>
-            <w:tcW w:w="1334" w:type="dxa"/>
+            <w:tcW w:w="1326" w:type="dxa"/>
             <w:tcBorders>
               <w:bottom w:val="single" w:sz="4" w:space="0" w:color="000000"/>
               <w:end w:val="single" w:sz="4" w:space="0" w:color="000000"/>
@@ -6959,7 +6749,7 @@
         </w:tc>
         <w:tc>
           <w:tcPr>
-            <w:tcW w:w="4166" w:type="dxa"/>
+            <w:tcW w:w="4168" w:type="dxa"/>
             <w:tcBorders>
               <w:bottom w:val="single" w:sz="4" w:space="0" w:color="000000"/>
               <w:end w:val="single" w:sz="4" w:space="0" w:color="000000"/>
@@ -6999,7 +6789,7 @@
         </w:trPr>
         <w:tc>
           <w:tcPr>
-            <w:tcW w:w="3176" w:type="dxa"/>
+            <w:tcW w:w="3057" w:type="dxa"/>
             <w:tcBorders>
               <w:start w:val="single" w:sz="4" w:space="0" w:color="000000"/>
               <w:bottom w:val="single" w:sz="4" w:space="0" w:color="000000"/>
@@ -7035,7 +6825,7 @@
         </w:tc>
         <w:tc>
           <w:tcPr>
-            <w:tcW w:w="1846" w:type="dxa"/>
+            <w:tcW w:w="1857" w:type="dxa"/>
             <w:tcBorders>
               <w:bottom w:val="single" w:sz="4" w:space="0" w:color="000000"/>
               <w:end w:val="single" w:sz="4" w:space="0" w:color="000000"/>
@@ -7070,7 +6860,7 @@
         </w:tc>
         <w:tc>
           <w:tcPr>
-            <w:tcW w:w="1334" w:type="dxa"/>
+            <w:tcW w:w="1326" w:type="dxa"/>
             <w:tcBorders>
               <w:bottom w:val="single" w:sz="4" w:space="0" w:color="000000"/>
               <w:end w:val="single" w:sz="4" w:space="0" w:color="000000"/>
@@ -7105,7 +6895,7 @@
         </w:tc>
         <w:tc>
           <w:tcPr>
-            <w:tcW w:w="4166" w:type="dxa"/>
+            <w:tcW w:w="4168" w:type="dxa"/>
             <w:tcBorders>
               <w:bottom w:val="single" w:sz="4" w:space="0" w:color="000000"/>
               <w:end w:val="single" w:sz="4" w:space="0" w:color="000000"/>
@@ -7145,7 +6935,7 @@
         </w:trPr>
         <w:tc>
           <w:tcPr>
-            <w:tcW w:w="3176" w:type="dxa"/>
+            <w:tcW w:w="3057" w:type="dxa"/>
             <w:tcBorders>
               <w:start w:val="single" w:sz="4" w:space="0" w:color="000000"/>
               <w:bottom w:val="single" w:sz="4" w:space="0" w:color="000000"/>
@@ -7181,7 +6971,7 @@
         </w:tc>
         <w:tc>
           <w:tcPr>
-            <w:tcW w:w="1846" w:type="dxa"/>
+            <w:tcW w:w="1857" w:type="dxa"/>
             <w:tcBorders>
               <w:bottom w:val="single" w:sz="4" w:space="0" w:color="000000"/>
               <w:end w:val="single" w:sz="4" w:space="0" w:color="000000"/>
@@ -7216,7 +7006,7 @@
         </w:tc>
         <w:tc>
           <w:tcPr>
-            <w:tcW w:w="1334" w:type="dxa"/>
+            <w:tcW w:w="1326" w:type="dxa"/>
             <w:tcBorders>
               <w:bottom w:val="single" w:sz="4" w:space="0" w:color="000000"/>
               <w:end w:val="single" w:sz="4" w:space="0" w:color="000000"/>
@@ -7251,7 +7041,7 @@
         </w:tc>
         <w:tc>
           <w:tcPr>
-            <w:tcW w:w="4166" w:type="dxa"/>
+            <w:tcW w:w="4168" w:type="dxa"/>
             <w:tcBorders>
               <w:bottom w:val="single" w:sz="4" w:space="0" w:color="000000"/>
               <w:end w:val="single" w:sz="4" w:space="0" w:color="000000"/>
@@ -7291,7 +7081,7 @@
         </w:trPr>
         <w:tc>
           <w:tcPr>
-            <w:tcW w:w="3176" w:type="dxa"/>
+            <w:tcW w:w="3057" w:type="dxa"/>
             <w:tcBorders>
               <w:start w:val="single" w:sz="4" w:space="0" w:color="000000"/>
               <w:bottom w:val="single" w:sz="4" w:space="0" w:color="000000"/>
@@ -7327,7 +7117,7 @@
         </w:tc>
         <w:tc>
           <w:tcPr>
-            <w:tcW w:w="1846" w:type="dxa"/>
+            <w:tcW w:w="1857" w:type="dxa"/>
             <w:tcBorders>
               <w:bottom w:val="single" w:sz="4" w:space="0" w:color="000000"/>
               <w:end w:val="single" w:sz="4" w:space="0" w:color="000000"/>
@@ -7362,7 +7152,7 @@
         </w:tc>
         <w:tc>
           <w:tcPr>
-            <w:tcW w:w="1334" w:type="dxa"/>
+            <w:tcW w:w="1326" w:type="dxa"/>
             <w:tcBorders>
               <w:bottom w:val="single" w:sz="4" w:space="0" w:color="000000"/>
               <w:end w:val="single" w:sz="4" w:space="0" w:color="000000"/>
@@ -7397,7 +7187,7 @@
         </w:tc>
         <w:tc>
           <w:tcPr>
-            <w:tcW w:w="4166" w:type="dxa"/>
+            <w:tcW w:w="4168" w:type="dxa"/>
             <w:tcBorders>
               <w:bottom w:val="single" w:sz="4" w:space="0" w:color="000000"/>
               <w:end w:val="single" w:sz="4" w:space="0" w:color="000000"/>
@@ -7437,7 +7227,7 @@
         </w:trPr>
         <w:tc>
           <w:tcPr>
-            <w:tcW w:w="3176" w:type="dxa"/>
+            <w:tcW w:w="3057" w:type="dxa"/>
             <w:tcBorders>
               <w:start w:val="single" w:sz="4" w:space="0" w:color="000000"/>
               <w:bottom w:val="single" w:sz="4" w:space="0" w:color="000000"/>
@@ -7473,7 +7263,7 @@
         </w:tc>
         <w:tc>
           <w:tcPr>
-            <w:tcW w:w="1846" w:type="dxa"/>
+            <w:tcW w:w="1857" w:type="dxa"/>
             <w:tcBorders>
               <w:bottom w:val="single" w:sz="4" w:space="0" w:color="000000"/>
               <w:end w:val="single" w:sz="4" w:space="0" w:color="000000"/>
@@ -7508,7 +7298,7 @@
         </w:tc>
         <w:tc>
           <w:tcPr>
-            <w:tcW w:w="1334" w:type="dxa"/>
+            <w:tcW w:w="1326" w:type="dxa"/>
             <w:tcBorders>
               <w:bottom w:val="single" w:sz="4" w:space="0" w:color="000000"/>
               <w:end w:val="single" w:sz="4" w:space="0" w:color="000000"/>
@@ -7543,7 +7333,7 @@
         </w:tc>
         <w:tc>
           <w:tcPr>
-            <w:tcW w:w="4166" w:type="dxa"/>
+            <w:tcW w:w="4168" w:type="dxa"/>
             <w:tcBorders>
               <w:bottom w:val="single" w:sz="4" w:space="0" w:color="000000"/>
               <w:end w:val="single" w:sz="4" w:space="0" w:color="000000"/>
@@ -7583,7 +7373,7 @@
         </w:trPr>
         <w:tc>
           <w:tcPr>
-            <w:tcW w:w="3176" w:type="dxa"/>
+            <w:tcW w:w="3057" w:type="dxa"/>
             <w:tcBorders>
               <w:start w:val="single" w:sz="4" w:space="0" w:color="000000"/>
               <w:bottom w:val="single" w:sz="4" w:space="0" w:color="000000"/>
@@ -7619,7 +7409,7 @@
         </w:tc>
         <w:tc>
           <w:tcPr>
-            <w:tcW w:w="1846" w:type="dxa"/>
+            <w:tcW w:w="1857" w:type="dxa"/>
             <w:tcBorders>
               <w:bottom w:val="single" w:sz="4" w:space="0" w:color="000000"/>
               <w:end w:val="single" w:sz="4" w:space="0" w:color="000000"/>
@@ -7654,7 +7444,7 @@
         </w:tc>
         <w:tc>
           <w:tcPr>
-            <w:tcW w:w="1334" w:type="dxa"/>
+            <w:tcW w:w="1326" w:type="dxa"/>
             <w:tcBorders>
               <w:bottom w:val="single" w:sz="4" w:space="0" w:color="000000"/>
               <w:end w:val="single" w:sz="4" w:space="0" w:color="000000"/>
@@ -7689,7 +7479,7 @@
         </w:tc>
         <w:tc>
           <w:tcPr>
-            <w:tcW w:w="4166" w:type="dxa"/>
+            <w:tcW w:w="4168" w:type="dxa"/>
             <w:tcBorders>
               <w:bottom w:val="single" w:sz="4" w:space="0" w:color="000000"/>
               <w:end w:val="single" w:sz="4" w:space="0" w:color="000000"/>
@@ -7729,7 +7519,7 @@
         </w:trPr>
         <w:tc>
           <w:tcPr>
-            <w:tcW w:w="3176" w:type="dxa"/>
+            <w:tcW w:w="3057" w:type="dxa"/>
             <w:tcBorders>
               <w:start w:val="single" w:sz="4" w:space="0" w:color="000000"/>
               <w:bottom w:val="single" w:sz="4" w:space="0" w:color="000000"/>
@@ -7765,7 +7555,7 @@
         </w:tc>
         <w:tc>
           <w:tcPr>
-            <w:tcW w:w="1846" w:type="dxa"/>
+            <w:tcW w:w="1857" w:type="dxa"/>
             <w:tcBorders>
               <w:bottom w:val="single" w:sz="4" w:space="0" w:color="000000"/>
               <w:end w:val="single" w:sz="4" w:space="0" w:color="000000"/>
@@ -7800,7 +7590,7 @@
         </w:tc>
         <w:tc>
           <w:tcPr>
-            <w:tcW w:w="1334" w:type="dxa"/>
+            <w:tcW w:w="1326" w:type="dxa"/>
             <w:tcBorders>
               <w:bottom w:val="single" w:sz="4" w:space="0" w:color="000000"/>
               <w:end w:val="single" w:sz="4" w:space="0" w:color="000000"/>
@@ -7835,7 +7625,7 @@
         </w:tc>
         <w:tc>
           <w:tcPr>
-            <w:tcW w:w="4166" w:type="dxa"/>
+            <w:tcW w:w="4168" w:type="dxa"/>
             <w:tcBorders>
               <w:bottom w:val="single" w:sz="4" w:space="0" w:color="000000"/>
               <w:end w:val="single" w:sz="4" w:space="0" w:color="000000"/>
@@ -7875,7 +7665,7 @@
         </w:trPr>
         <w:tc>
           <w:tcPr>
-            <w:tcW w:w="3176" w:type="dxa"/>
+            <w:tcW w:w="3057" w:type="dxa"/>
             <w:tcBorders>
               <w:start w:val="single" w:sz="4" w:space="0" w:color="000000"/>
               <w:bottom w:val="single" w:sz="4" w:space="0" w:color="000000"/>
@@ -7911,7 +7701,7 @@
         </w:tc>
         <w:tc>
           <w:tcPr>
-            <w:tcW w:w="1846" w:type="dxa"/>
+            <w:tcW w:w="1857" w:type="dxa"/>
             <w:tcBorders>
               <w:bottom w:val="single" w:sz="4" w:space="0" w:color="000000"/>
               <w:end w:val="single" w:sz="4" w:space="0" w:color="000000"/>
@@ -7946,7 +7736,7 @@
         </w:tc>
         <w:tc>
           <w:tcPr>
-            <w:tcW w:w="1334" w:type="dxa"/>
+            <w:tcW w:w="1326" w:type="dxa"/>
             <w:tcBorders>
               <w:bottom w:val="single" w:sz="4" w:space="0" w:color="000000"/>
               <w:end w:val="single" w:sz="4" w:space="0" w:color="000000"/>
@@ -7981,7 +7771,7 @@
         </w:tc>
         <w:tc>
           <w:tcPr>
-            <w:tcW w:w="4166" w:type="dxa"/>
+            <w:tcW w:w="4168" w:type="dxa"/>
             <w:tcBorders>
               <w:bottom w:val="single" w:sz="4" w:space="0" w:color="000000"/>
               <w:end w:val="single" w:sz="4" w:space="0" w:color="000000"/>
@@ -8021,7 +7811,7 @@
         </w:trPr>
         <w:tc>
           <w:tcPr>
-            <w:tcW w:w="3176" w:type="dxa"/>
+            <w:tcW w:w="3057" w:type="dxa"/>
             <w:tcBorders>
               <w:start w:val="single" w:sz="4" w:space="0" w:color="000000"/>
               <w:bottom w:val="single" w:sz="4" w:space="0" w:color="000000"/>
@@ -8057,7 +7847,7 @@
         </w:tc>
         <w:tc>
           <w:tcPr>
-            <w:tcW w:w="1846" w:type="dxa"/>
+            <w:tcW w:w="1857" w:type="dxa"/>
             <w:tcBorders>
               <w:bottom w:val="single" w:sz="4" w:space="0" w:color="000000"/>
               <w:end w:val="single" w:sz="4" w:space="0" w:color="000000"/>
@@ -8092,40 +7882,40 @@
         </w:tc>
         <w:tc>
           <w:tcPr>
-            <w:tcW w:w="1334" w:type="dxa"/>
-            <w:tcBorders>
-              <w:bottom w:val="single" w:sz="4" w:space="0" w:color="000000"/>
-              <w:end w:val="single" w:sz="4" w:space="0" w:color="000000"/>
-            </w:tcBorders>
-            <w:vAlign w:val="bottom"/>
-          </w:tcPr>
-          <w:p>
-            <w:pPr>
-              <w:pStyle w:val="Normal"/>
-              <w:spacing w:lineRule="auto" w:line="240" w:before="0" w:after="0"/>
-              <w:ind w:start="0"/>
-              <w:rPr>
-                <w:rFonts w:ascii="Calibri" w:hAnsi="Calibri" w:eastAsia="Times New Roman" w:cs="Calibri"/>
-                <w:color w:val="000000"/>
-                <w:sz w:val="24"/>
-                <w:szCs w:val="24"/>
-                <w:lang w:val="en-IN" w:eastAsia="en-IN"/>
-              </w:rPr>
-            </w:pPr>
-            <w:r>
-              <w:rPr>
-                <w:rFonts w:eastAsia="Times New Roman" w:cs="Calibri" w:ascii="Calibri" w:hAnsi="Calibri"/>
-                <w:color w:val="000000"/>
-                <w:sz w:val="24"/>
-                <w:szCs w:val="24"/>
-                <w:lang w:val="en-IN" w:eastAsia="en-IN"/>
-              </w:rPr>
-            </w:r>
-          </w:p>
-        </w:tc>
-        <w:tc>
-          <w:tcPr>
-            <w:tcW w:w="4166" w:type="dxa"/>
+            <w:tcW w:w="1326" w:type="dxa"/>
+            <w:tcBorders>
+              <w:bottom w:val="single" w:sz="4" w:space="0" w:color="000000"/>
+              <w:end w:val="single" w:sz="4" w:space="0" w:color="000000"/>
+            </w:tcBorders>
+            <w:vAlign w:val="bottom"/>
+          </w:tcPr>
+          <w:p>
+            <w:pPr>
+              <w:pStyle w:val="Normal"/>
+              <w:spacing w:lineRule="auto" w:line="240" w:before="0" w:after="0"/>
+              <w:ind w:start="0"/>
+              <w:rPr>
+                <w:rFonts w:ascii="Calibri" w:hAnsi="Calibri" w:eastAsia="Times New Roman" w:cs="Calibri"/>
+                <w:color w:val="000000"/>
+                <w:sz w:val="24"/>
+                <w:szCs w:val="24"/>
+                <w:lang w:val="en-IN" w:eastAsia="en-IN"/>
+              </w:rPr>
+            </w:pPr>
+            <w:r>
+              <w:rPr>
+                <w:rFonts w:eastAsia="Times New Roman" w:cs="Calibri" w:ascii="Calibri" w:hAnsi="Calibri"/>
+                <w:color w:val="000000"/>
+                <w:sz w:val="24"/>
+                <w:szCs w:val="24"/>
+                <w:lang w:val="en-IN" w:eastAsia="en-IN"/>
+              </w:rPr>
+            </w:r>
+          </w:p>
+        </w:tc>
+        <w:tc>
+          <w:tcPr>
+            <w:tcW w:w="4168" w:type="dxa"/>
             <w:tcBorders>
               <w:bottom w:val="single" w:sz="4" w:space="0" w:color="000000"/>
               <w:end w:val="single" w:sz="4" w:space="0" w:color="000000"/>
@@ -8165,7 +7955,7 @@
         </w:trPr>
         <w:tc>
           <w:tcPr>
-            <w:tcW w:w="3176" w:type="dxa"/>
+            <w:tcW w:w="3057" w:type="dxa"/>
             <w:tcBorders>
               <w:start w:val="single" w:sz="4" w:space="0" w:color="000000"/>
               <w:bottom w:val="single" w:sz="4" w:space="0" w:color="000000"/>
@@ -8201,7 +7991,7 @@
         </w:tc>
         <w:tc>
           <w:tcPr>
-            <w:tcW w:w="1846" w:type="dxa"/>
+            <w:tcW w:w="1857" w:type="dxa"/>
             <w:tcBorders>
               <w:bottom w:val="single" w:sz="4" w:space="0" w:color="000000"/>
               <w:end w:val="single" w:sz="4" w:space="0" w:color="000000"/>
@@ -8236,7 +8026,7 @@
         </w:tc>
         <w:tc>
           <w:tcPr>
-            <w:tcW w:w="1334" w:type="dxa"/>
+            <w:tcW w:w="1326" w:type="dxa"/>
             <w:tcBorders>
               <w:bottom w:val="single" w:sz="4" w:space="0" w:color="000000"/>
               <w:end w:val="single" w:sz="4" w:space="0" w:color="000000"/>
@@ -8271,7 +8061,7 @@
         </w:tc>
         <w:tc>
           <w:tcPr>
-            <w:tcW w:w="4166" w:type="dxa"/>
+            <w:tcW w:w="4168" w:type="dxa"/>
             <w:tcBorders>
               <w:bottom w:val="single" w:sz="4" w:space="0" w:color="000000"/>
               <w:end w:val="single" w:sz="4" w:space="0" w:color="000000"/>
@@ -8311,7 +8101,7 @@
         </w:trPr>
         <w:tc>
           <w:tcPr>
-            <w:tcW w:w="3176" w:type="dxa"/>
+            <w:tcW w:w="3057" w:type="dxa"/>
             <w:tcBorders>
               <w:start w:val="single" w:sz="4" w:space="0" w:color="000000"/>
               <w:bottom w:val="single" w:sz="4" w:space="0" w:color="000000"/>
@@ -8347,7 +8137,7 @@
         </w:tc>
         <w:tc>
           <w:tcPr>
-            <w:tcW w:w="1846" w:type="dxa"/>
+            <w:tcW w:w="1857" w:type="dxa"/>
             <w:tcBorders>
               <w:bottom w:val="single" w:sz="4" w:space="0" w:color="000000"/>
               <w:end w:val="single" w:sz="4" w:space="0" w:color="000000"/>
@@ -8382,7 +8172,7 @@
         </w:tc>
         <w:tc>
           <w:tcPr>
-            <w:tcW w:w="1334" w:type="dxa"/>
+            <w:tcW w:w="1326" w:type="dxa"/>
             <w:tcBorders>
               <w:bottom w:val="single" w:sz="4" w:space="0" w:color="000000"/>
               <w:end w:val="single" w:sz="4" w:space="0" w:color="000000"/>
@@ -8417,7 +8207,7 @@
         </w:tc>
         <w:tc>
           <w:tcPr>
-            <w:tcW w:w="4166" w:type="dxa"/>
+            <w:tcW w:w="4168" w:type="dxa"/>
             <w:tcBorders>
               <w:bottom w:val="single" w:sz="4" w:space="0" w:color="000000"/>
               <w:end w:val="single" w:sz="4" w:space="0" w:color="000000"/>
@@ -8431,22 +8221,20 @@
               <w:ind w:start="0"/>
               <w:jc w:val="start"/>
               <w:rPr>
-                <w:rFonts w:ascii="Calibri" w:hAnsi="Calibri" w:eastAsia="Times New Roman" w:cs="Calibri"/>
-                <w:color w:val="000000"/>
-                <w:sz w:val="24"/>
-                <w:szCs w:val="24"/>
-                <w:lang w:val="en-IN" w:eastAsia="en-IN"/>
-              </w:rPr>
-            </w:pPr>
-            <w:r>
-              <w:rPr>
-                <w:rFonts w:eastAsia="Times New Roman" w:cs="Calibri" w:ascii="Calibri" w:hAnsi="Calibri"/>
-                <w:color w:val="000000"/>
-                <w:sz w:val="24"/>
-                <w:szCs w:val="24"/>
-                <w:lang w:val="en-IN" w:eastAsia="en-IN"/>
-              </w:rPr>
-              <w:t>The value should be auto-fetched based on the selected Vendor Name and Vendor Code (from Basic Details panel) (First column) from the 7th column of the Staging Data (VC_BASIC_DETAILS) or the 7th column of Reference Table 1.1. This field should be non-editable.</w:t>
+                <w:highlight w:val="none"/>
+                <w:shd w:fill="FFFF00" w:val="clear"/>
+              </w:rPr>
+            </w:pPr>
+            <w:r>
+              <w:rPr>
+                <w:rFonts w:eastAsia="Times New Roman" w:cs="Calibri" w:ascii="Calibri" w:hAnsi="Calibri"/>
+                <w:color w:val="000000"/>
+                <w:sz w:val="24"/>
+                <w:szCs w:val="24"/>
+                <w:shd w:fill="FFFF00" w:val="clear"/>
+                <w:lang w:val="en-IN" w:eastAsia="en-IN"/>
+              </w:rPr>
+              <w:t xml:space="preserve">The value should be auto-fetched based on the selected Vendor Name and Vendor Code (from Basic Details panel) (First column) from the 7th column of the Staging Data (VC_BASIC_DETAILS) or the 7th column of Reference Table 1.1. This field should be non-editable. </w:t>
             </w:r>
           </w:p>
         </w:tc>
@@ -8457,7 +8245,7 @@
         </w:trPr>
         <w:tc>
           <w:tcPr>
-            <w:tcW w:w="3176" w:type="dxa"/>
+            <w:tcW w:w="3057" w:type="dxa"/>
             <w:tcBorders>
               <w:start w:val="single" w:sz="4" w:space="0" w:color="000000"/>
               <w:bottom w:val="single" w:sz="4" w:space="0" w:color="000000"/>
@@ -8493,7 +8281,7 @@
         </w:tc>
         <w:tc>
           <w:tcPr>
-            <w:tcW w:w="1846" w:type="dxa"/>
+            <w:tcW w:w="1857" w:type="dxa"/>
             <w:tcBorders>
               <w:bottom w:val="single" w:sz="4" w:space="0" w:color="000000"/>
               <w:end w:val="single" w:sz="4" w:space="0" w:color="000000"/>
@@ -8528,7 +8316,7 @@
         </w:tc>
         <w:tc>
           <w:tcPr>
-            <w:tcW w:w="1334" w:type="dxa"/>
+            <w:tcW w:w="1326" w:type="dxa"/>
             <w:tcBorders>
               <w:bottom w:val="single" w:sz="4" w:space="0" w:color="000000"/>
               <w:end w:val="single" w:sz="4" w:space="0" w:color="000000"/>
@@ -8563,7 +8351,7 @@
         </w:tc>
         <w:tc>
           <w:tcPr>
-            <w:tcW w:w="4166" w:type="dxa"/>
+            <w:tcW w:w="4168" w:type="dxa"/>
             <w:tcBorders>
               <w:bottom w:val="single" w:sz="4" w:space="0" w:color="000000"/>
               <w:end w:val="single" w:sz="4" w:space="0" w:color="000000"/>
@@ -8603,7 +8391,7 @@
         </w:trPr>
         <w:tc>
           <w:tcPr>
-            <w:tcW w:w="3176" w:type="dxa"/>
+            <w:tcW w:w="3057" w:type="dxa"/>
             <w:tcBorders>
               <w:start w:val="single" w:sz="4" w:space="0" w:color="000000"/>
               <w:bottom w:val="single" w:sz="4" w:space="0" w:color="000000"/>
@@ -8639,7 +8427,7 @@
         </w:tc>
         <w:tc>
           <w:tcPr>
-            <w:tcW w:w="1846" w:type="dxa"/>
+            <w:tcW w:w="1857" w:type="dxa"/>
             <w:tcBorders>
               <w:bottom w:val="single" w:sz="4" w:space="0" w:color="000000"/>
               <w:end w:val="single" w:sz="4" w:space="0" w:color="000000"/>
@@ -8674,7 +8462,7 @@
         </w:tc>
         <w:tc>
           <w:tcPr>
-            <w:tcW w:w="1334" w:type="dxa"/>
+            <w:tcW w:w="1326" w:type="dxa"/>
             <w:tcBorders>
               <w:bottom w:val="single" w:sz="4" w:space="0" w:color="000000"/>
               <w:end w:val="single" w:sz="4" w:space="0" w:color="000000"/>
@@ -8709,7 +8497,7 @@
         </w:tc>
         <w:tc>
           <w:tcPr>
-            <w:tcW w:w="4166" w:type="dxa"/>
+            <w:tcW w:w="4168" w:type="dxa"/>
             <w:tcBorders>
               <w:bottom w:val="single" w:sz="4" w:space="0" w:color="000000"/>
               <w:end w:val="single" w:sz="4" w:space="0" w:color="000000"/>
@@ -8723,19 +8511,17 @@
               <w:ind w:start="0"/>
               <w:jc w:val="start"/>
               <w:rPr>
-                <w:rFonts w:ascii="Calibri" w:hAnsi="Calibri" w:eastAsia="Times New Roman" w:cs="Calibri"/>
-                <w:color w:val="000000"/>
-                <w:sz w:val="24"/>
-                <w:szCs w:val="24"/>
-                <w:lang w:val="en-IN" w:eastAsia="en-IN"/>
-              </w:rPr>
-            </w:pPr>
-            <w:r>
-              <w:rPr>
-                <w:rFonts w:eastAsia="Times New Roman" w:cs="Calibri" w:ascii="Calibri" w:hAnsi="Calibri"/>
-                <w:color w:val="000000"/>
-                <w:sz w:val="24"/>
-                <w:szCs w:val="24"/>
+                <w:highlight w:val="none"/>
+                <w:shd w:fill="FFFF00" w:val="clear"/>
+              </w:rPr>
+            </w:pPr>
+            <w:r>
+              <w:rPr>
+                <w:rFonts w:eastAsia="Times New Roman" w:cs="Calibri" w:ascii="Calibri" w:hAnsi="Calibri"/>
+                <w:color w:val="000000"/>
+                <w:sz w:val="24"/>
+                <w:szCs w:val="24"/>
+                <w:shd w:fill="FFFF00" w:val="clear"/>
                 <w:lang w:val="en-IN" w:eastAsia="en-IN"/>
               </w:rPr>
               <w:t>The value should be auto-fetched based on the selected Vendor Name and Vendor Code (from Basic Details panel) (First column) from the 7th column of the Staging Data (VC_BASIC_DETAILS) or the 7th column of Reference Table 1.1. This field should be non-editable.</w:t>
@@ -8749,7 +8535,7 @@
         </w:trPr>
         <w:tc>
           <w:tcPr>
-            <w:tcW w:w="3176" w:type="dxa"/>
+            <w:tcW w:w="3057" w:type="dxa"/>
             <w:tcBorders>
               <w:start w:val="single" w:sz="4" w:space="0" w:color="000000"/>
               <w:bottom w:val="single" w:sz="4" w:space="0" w:color="000000"/>
@@ -8785,7 +8571,7 @@
         </w:tc>
         <w:tc>
           <w:tcPr>
-            <w:tcW w:w="1846" w:type="dxa"/>
+            <w:tcW w:w="1857" w:type="dxa"/>
             <w:tcBorders>
               <w:bottom w:val="single" w:sz="4" w:space="0" w:color="000000"/>
               <w:end w:val="single" w:sz="4" w:space="0" w:color="000000"/>
@@ -8820,7 +8606,7 @@
         </w:tc>
         <w:tc>
           <w:tcPr>
-            <w:tcW w:w="1334" w:type="dxa"/>
+            <w:tcW w:w="1326" w:type="dxa"/>
             <w:tcBorders>
               <w:bottom w:val="single" w:sz="4" w:space="0" w:color="000000"/>
               <w:end w:val="single" w:sz="4" w:space="0" w:color="000000"/>
@@ -8855,7 +8641,7 @@
         </w:tc>
         <w:tc>
           <w:tcPr>
-            <w:tcW w:w="4166" w:type="dxa"/>
+            <w:tcW w:w="4168" w:type="dxa"/>
             <w:tcBorders>
               <w:bottom w:val="single" w:sz="4" w:space="0" w:color="000000"/>
               <w:end w:val="single" w:sz="4" w:space="0" w:color="000000"/>
@@ -8895,7 +8681,7 @@
         </w:trPr>
         <w:tc>
           <w:tcPr>
-            <w:tcW w:w="3176" w:type="dxa"/>
+            <w:tcW w:w="3057" w:type="dxa"/>
             <w:tcBorders>
               <w:start w:val="single" w:sz="4" w:space="0" w:color="000000"/>
               <w:bottom w:val="single" w:sz="4" w:space="0" w:color="000000"/>
@@ -8931,7 +8717,7 @@
         </w:tc>
         <w:tc>
           <w:tcPr>
-            <w:tcW w:w="1846" w:type="dxa"/>
+            <w:tcW w:w="1857" w:type="dxa"/>
             <w:tcBorders>
               <w:bottom w:val="single" w:sz="4" w:space="0" w:color="000000"/>
               <w:end w:val="single" w:sz="4" w:space="0" w:color="000000"/>
@@ -8966,7 +8752,7 @@
         </w:tc>
         <w:tc>
           <w:tcPr>
-            <w:tcW w:w="1334" w:type="dxa"/>
+            <w:tcW w:w="1326" w:type="dxa"/>
             <w:tcBorders>
               <w:bottom w:val="single" w:sz="4" w:space="0" w:color="000000"/>
               <w:end w:val="single" w:sz="4" w:space="0" w:color="000000"/>
@@ -9001,7 +8787,7 @@
         </w:tc>
         <w:tc>
           <w:tcPr>
-            <w:tcW w:w="4166" w:type="dxa"/>
+            <w:tcW w:w="4168" w:type="dxa"/>
             <w:tcBorders>
               <w:bottom w:val="single" w:sz="4" w:space="0" w:color="000000"/>
               <w:end w:val="single" w:sz="4" w:space="0" w:color="000000"/>
@@ -9030,7 +8816,18 @@
                 <w:szCs w:val="24"/>
                 <w:lang w:val="en-IN" w:eastAsia="en-IN"/>
               </w:rPr>
-              <w:t>Pidilite says it will be updated in Staging Data, awaiting for the update</w:t>
+              <w:t xml:space="preserve">Pidilite says it will be updated in Staging Data, awaiting for the update. </w:t>
+            </w:r>
+            <w:r>
+              <w:rPr>
+                <w:rFonts w:eastAsia="Times New Roman" w:cs="Calibri" w:ascii="Calibri" w:hAnsi="Calibri"/>
+                <w:color w:val="000000"/>
+                <w:sz w:val="24"/>
+                <w:szCs w:val="24"/>
+                <w:shd w:fill="FFFF00" w:val="clear"/>
+                <w:lang w:val="en-IN" w:eastAsia="en-IN"/>
+              </w:rPr>
+              <w:t>This should be non editable.</w:t>
             </w:r>
           </w:p>
         </w:tc>
@@ -9041,7 +8838,7 @@
         </w:trPr>
         <w:tc>
           <w:tcPr>
-            <w:tcW w:w="3176" w:type="dxa"/>
+            <w:tcW w:w="3057" w:type="dxa"/>
             <w:tcBorders>
               <w:start w:val="single" w:sz="4" w:space="0" w:color="000000"/>
               <w:bottom w:val="single" w:sz="4" w:space="0" w:color="000000"/>
@@ -9077,7 +8874,7 @@
         </w:tc>
         <w:tc>
           <w:tcPr>
-            <w:tcW w:w="1846" w:type="dxa"/>
+            <w:tcW w:w="1857" w:type="dxa"/>
             <w:tcBorders>
               <w:bottom w:val="single" w:sz="4" w:space="0" w:color="000000"/>
               <w:end w:val="single" w:sz="4" w:space="0" w:color="000000"/>
@@ -9112,7 +8909,7 @@
         </w:tc>
         <w:tc>
           <w:tcPr>
-            <w:tcW w:w="1334" w:type="dxa"/>
+            <w:tcW w:w="1326" w:type="dxa"/>
             <w:tcBorders>
               <w:bottom w:val="single" w:sz="4" w:space="0" w:color="000000"/>
               <w:end w:val="single" w:sz="4" w:space="0" w:color="000000"/>
@@ -9147,7 +8944,7 @@
         </w:tc>
         <w:tc>
           <w:tcPr>
-            <w:tcW w:w="4166" w:type="dxa"/>
+            <w:tcW w:w="4168" w:type="dxa"/>
             <w:tcBorders>
               <w:bottom w:val="single" w:sz="4" w:space="0" w:color="000000"/>
               <w:end w:val="single" w:sz="4" w:space="0" w:color="000000"/>
@@ -9176,7 +8973,18 @@
                 <w:szCs w:val="24"/>
                 <w:lang w:val="en-IN" w:eastAsia="en-IN"/>
               </w:rPr>
-              <w:t>Pidilite says it will be updated in Staging Data, awaiting for the update</w:t>
+              <w:t xml:space="preserve">Pidilite says it will be updated in Staging Data, awaiting for the update. </w:t>
+            </w:r>
+            <w:r>
+              <w:rPr>
+                <w:rFonts w:eastAsia="Times New Roman" w:cs="Calibri" w:ascii="Calibri" w:hAnsi="Calibri"/>
+                <w:color w:val="000000"/>
+                <w:sz w:val="24"/>
+                <w:szCs w:val="24"/>
+                <w:shd w:fill="FFFF00" w:val="clear"/>
+                <w:lang w:val="en-IN" w:eastAsia="en-IN"/>
+              </w:rPr>
+              <w:t>This should be non editable.</w:t>
             </w:r>
           </w:p>
         </w:tc>
@@ -9187,7 +8995,7 @@
         </w:trPr>
         <w:tc>
           <w:tcPr>
-            <w:tcW w:w="3176" w:type="dxa"/>
+            <w:tcW w:w="3057" w:type="dxa"/>
             <w:tcBorders>
               <w:start w:val="single" w:sz="4" w:space="0" w:color="000000"/>
               <w:bottom w:val="single" w:sz="4" w:space="0" w:color="000000"/>
@@ -9217,13 +9025,13 @@
                 <w:szCs w:val="24"/>
                 <w:lang w:val="en-IN" w:eastAsia="en-IN"/>
               </w:rPr>
-              <w:t>Purchase Organization Details</w:t>
-            </w:r>
-          </w:p>
-        </w:tc>
-        <w:tc>
-          <w:tcPr>
-            <w:tcW w:w="1846" w:type="dxa"/>
+              <w:t>Vendor Extension Details</w:t>
+            </w:r>
+          </w:p>
+        </w:tc>
+        <w:tc>
+          <w:tcPr>
+            <w:tcW w:w="1857" w:type="dxa"/>
             <w:tcBorders>
               <w:bottom w:val="single" w:sz="4" w:space="0" w:color="000000"/>
               <w:end w:val="single" w:sz="4" w:space="0" w:color="000000"/>
@@ -9258,40 +9066,40 @@
         </w:tc>
         <w:tc>
           <w:tcPr>
-            <w:tcW w:w="1334" w:type="dxa"/>
-            <w:tcBorders>
-              <w:bottom w:val="single" w:sz="4" w:space="0" w:color="000000"/>
-              <w:end w:val="single" w:sz="4" w:space="0" w:color="000000"/>
-            </w:tcBorders>
-            <w:vAlign w:val="bottom"/>
-          </w:tcPr>
-          <w:p>
-            <w:pPr>
-              <w:pStyle w:val="Normal"/>
-              <w:spacing w:lineRule="auto" w:line="240" w:before="0" w:after="0"/>
-              <w:ind w:start="0"/>
-              <w:rPr>
-                <w:rFonts w:ascii="Calibri" w:hAnsi="Calibri" w:eastAsia="Times New Roman" w:cs="Calibri"/>
-                <w:color w:val="000000"/>
-                <w:sz w:val="24"/>
-                <w:szCs w:val="24"/>
-                <w:lang w:val="en-IN" w:eastAsia="en-IN"/>
-              </w:rPr>
-            </w:pPr>
-            <w:r>
-              <w:rPr>
-                <w:rFonts w:eastAsia="Times New Roman" w:cs="Calibri" w:ascii="Calibri" w:hAnsi="Calibri"/>
-                <w:color w:val="000000"/>
-                <w:sz w:val="24"/>
-                <w:szCs w:val="24"/>
-                <w:lang w:val="en-IN" w:eastAsia="en-IN"/>
-              </w:rPr>
-            </w:r>
-          </w:p>
-        </w:tc>
-        <w:tc>
-          <w:tcPr>
-            <w:tcW w:w="4166" w:type="dxa"/>
+            <w:tcW w:w="1326" w:type="dxa"/>
+            <w:tcBorders>
+              <w:bottom w:val="single" w:sz="4" w:space="0" w:color="000000"/>
+              <w:end w:val="single" w:sz="4" w:space="0" w:color="000000"/>
+            </w:tcBorders>
+            <w:vAlign w:val="bottom"/>
+          </w:tcPr>
+          <w:p>
+            <w:pPr>
+              <w:pStyle w:val="Normal"/>
+              <w:spacing w:lineRule="auto" w:line="240" w:before="0" w:after="0"/>
+              <w:ind w:start="0"/>
+              <w:rPr>
+                <w:rFonts w:ascii="Calibri" w:hAnsi="Calibri" w:eastAsia="Times New Roman" w:cs="Calibri"/>
+                <w:color w:val="000000"/>
+                <w:sz w:val="24"/>
+                <w:szCs w:val="24"/>
+                <w:lang w:val="en-IN" w:eastAsia="en-IN"/>
+              </w:rPr>
+            </w:pPr>
+            <w:r>
+              <w:rPr>
+                <w:rFonts w:eastAsia="Times New Roman" w:cs="Calibri" w:ascii="Calibri" w:hAnsi="Calibri"/>
+                <w:color w:val="000000"/>
+                <w:sz w:val="24"/>
+                <w:szCs w:val="24"/>
+                <w:lang w:val="en-IN" w:eastAsia="en-IN"/>
+              </w:rPr>
+            </w:r>
+          </w:p>
+        </w:tc>
+        <w:tc>
+          <w:tcPr>
+            <w:tcW w:w="4168" w:type="dxa"/>
             <w:tcBorders>
               <w:bottom w:val="single" w:sz="4" w:space="0" w:color="000000"/>
               <w:end w:val="single" w:sz="4" w:space="0" w:color="000000"/>
@@ -9331,7 +9139,7 @@
         </w:trPr>
         <w:tc>
           <w:tcPr>
-            <w:tcW w:w="3176" w:type="dxa"/>
+            <w:tcW w:w="3057" w:type="dxa"/>
             <w:tcBorders>
               <w:start w:val="single" w:sz="4" w:space="0" w:color="000000"/>
               <w:bottom w:val="single" w:sz="4" w:space="0" w:color="000000"/>
@@ -9361,13 +9169,23 @@
                 <w:szCs w:val="24"/>
                 <w:lang w:val="en-IN" w:eastAsia="en-IN"/>
               </w:rPr>
-              <w:t>Company Code and Purchase Org</w:t>
-            </w:r>
-          </w:p>
-        </w:tc>
-        <w:tc>
-          <w:tcPr>
-            <w:tcW w:w="1846" w:type="dxa"/>
+              <w:t xml:space="preserve">Company Code and Purchase Org </w:t>
+            </w:r>
+            <w:r>
+              <w:rPr>
+                <w:rFonts w:eastAsia="Times New Roman" w:cs="Calibri" w:ascii="Calibri" w:hAnsi="Calibri"/>
+                <w:color w:val="000000"/>
+                <w:sz w:val="24"/>
+                <w:szCs w:val="24"/>
+                <w:lang w:val="en-IN" w:eastAsia="en-IN"/>
+              </w:rPr>
+              <w:t>Extended To</w:t>
+            </w:r>
+          </w:p>
+        </w:tc>
+        <w:tc>
+          <w:tcPr>
+            <w:tcW w:w="1857" w:type="dxa"/>
             <w:tcBorders>
               <w:bottom w:val="single" w:sz="4" w:space="0" w:color="000000"/>
               <w:end w:val="single" w:sz="4" w:space="0" w:color="000000"/>
@@ -9402,40 +9220,40 @@
         </w:tc>
         <w:tc>
           <w:tcPr>
-            <w:tcW w:w="1334" w:type="dxa"/>
-            <w:tcBorders>
-              <w:bottom w:val="single" w:sz="4" w:space="0" w:color="000000"/>
-              <w:end w:val="single" w:sz="4" w:space="0" w:color="000000"/>
-            </w:tcBorders>
-            <w:vAlign w:val="bottom"/>
-          </w:tcPr>
-          <w:p>
-            <w:pPr>
-              <w:pStyle w:val="Normal"/>
-              <w:spacing w:lineRule="auto" w:line="240" w:before="0" w:after="0"/>
-              <w:ind w:start="0"/>
-              <w:rPr>
-                <w:rFonts w:ascii="Calibri" w:hAnsi="Calibri" w:eastAsia="Times New Roman" w:cs="Calibri"/>
-                <w:color w:val="000000"/>
-                <w:sz w:val="24"/>
-                <w:szCs w:val="24"/>
-                <w:lang w:val="en-IN" w:eastAsia="en-IN"/>
-              </w:rPr>
-            </w:pPr>
-            <w:r>
-              <w:rPr>
-                <w:rFonts w:eastAsia="Times New Roman" w:cs="Calibri" w:ascii="Calibri" w:hAnsi="Calibri"/>
-                <w:color w:val="000000"/>
-                <w:sz w:val="24"/>
-                <w:szCs w:val="24"/>
-                <w:lang w:val="en-IN" w:eastAsia="en-IN"/>
-              </w:rPr>
-            </w:r>
-          </w:p>
-        </w:tc>
-        <w:tc>
-          <w:tcPr>
-            <w:tcW w:w="4166" w:type="dxa"/>
+            <w:tcW w:w="1326" w:type="dxa"/>
+            <w:tcBorders>
+              <w:bottom w:val="single" w:sz="4" w:space="0" w:color="000000"/>
+              <w:end w:val="single" w:sz="4" w:space="0" w:color="000000"/>
+            </w:tcBorders>
+            <w:vAlign w:val="bottom"/>
+          </w:tcPr>
+          <w:p>
+            <w:pPr>
+              <w:pStyle w:val="Normal"/>
+              <w:spacing w:lineRule="auto" w:line="240" w:before="0" w:after="0"/>
+              <w:ind w:start="0"/>
+              <w:rPr>
+                <w:rFonts w:ascii="Calibri" w:hAnsi="Calibri" w:eastAsia="Times New Roman" w:cs="Calibri"/>
+                <w:color w:val="000000"/>
+                <w:sz w:val="24"/>
+                <w:szCs w:val="24"/>
+                <w:lang w:val="en-IN" w:eastAsia="en-IN"/>
+              </w:rPr>
+            </w:pPr>
+            <w:r>
+              <w:rPr>
+                <w:rFonts w:eastAsia="Times New Roman" w:cs="Calibri" w:ascii="Calibri" w:hAnsi="Calibri"/>
+                <w:color w:val="000000"/>
+                <w:sz w:val="24"/>
+                <w:szCs w:val="24"/>
+                <w:lang w:val="en-IN" w:eastAsia="en-IN"/>
+              </w:rPr>
+            </w:r>
+          </w:p>
+        </w:tc>
+        <w:tc>
+          <w:tcPr>
+            <w:tcW w:w="4168" w:type="dxa"/>
             <w:tcBorders>
               <w:bottom w:val="single" w:sz="4" w:space="0" w:color="000000"/>
               <w:end w:val="single" w:sz="4" w:space="0" w:color="000000"/>
@@ -9475,7 +9293,7 @@
         </w:trPr>
         <w:tc>
           <w:tcPr>
-            <w:tcW w:w="3176" w:type="dxa"/>
+            <w:tcW w:w="3057" w:type="dxa"/>
             <w:tcBorders>
               <w:start w:val="single" w:sz="4" w:space="0" w:color="000000"/>
               <w:bottom w:val="single" w:sz="4" w:space="0" w:color="000000"/>
@@ -9511,7 +9329,7 @@
         </w:tc>
         <w:tc>
           <w:tcPr>
-            <w:tcW w:w="1846" w:type="dxa"/>
+            <w:tcW w:w="1857" w:type="dxa"/>
             <w:tcBorders>
               <w:bottom w:val="single" w:sz="4" w:space="0" w:color="000000"/>
               <w:end w:val="single" w:sz="4" w:space="0" w:color="000000"/>
@@ -9546,7 +9364,7 @@
         </w:tc>
         <w:tc>
           <w:tcPr>
-            <w:tcW w:w="1334" w:type="dxa"/>
+            <w:tcW w:w="1326" w:type="dxa"/>
             <w:tcBorders>
               <w:bottom w:val="single" w:sz="4" w:space="0" w:color="000000"/>
               <w:end w:val="single" w:sz="4" w:space="0" w:color="000000"/>
@@ -9581,7 +9399,7 @@
         </w:tc>
         <w:tc>
           <w:tcPr>
-            <w:tcW w:w="4166" w:type="dxa"/>
+            <w:tcW w:w="4168" w:type="dxa"/>
             <w:tcBorders>
               <w:bottom w:val="single" w:sz="4" w:space="0" w:color="000000"/>
               <w:end w:val="single" w:sz="4" w:space="0" w:color="000000"/>
@@ -9621,7 +9439,7 @@
         </w:trPr>
         <w:tc>
           <w:tcPr>
-            <w:tcW w:w="3176" w:type="dxa"/>
+            <w:tcW w:w="3057" w:type="dxa"/>
             <w:tcBorders>
               <w:start w:val="single" w:sz="4" w:space="0" w:color="000000"/>
               <w:bottom w:val="single" w:sz="4" w:space="0" w:color="000000"/>
@@ -9657,7 +9475,7 @@
         </w:tc>
         <w:tc>
           <w:tcPr>
-            <w:tcW w:w="1846" w:type="dxa"/>
+            <w:tcW w:w="1857" w:type="dxa"/>
             <w:tcBorders>
               <w:bottom w:val="single" w:sz="4" w:space="0" w:color="000000"/>
               <w:end w:val="single" w:sz="4" w:space="0" w:color="000000"/>
@@ -9692,7 +9510,7 @@
         </w:tc>
         <w:tc>
           <w:tcPr>
-            <w:tcW w:w="1334" w:type="dxa"/>
+            <w:tcW w:w="1326" w:type="dxa"/>
             <w:tcBorders>
               <w:bottom w:val="single" w:sz="4" w:space="0" w:color="000000"/>
               <w:end w:val="single" w:sz="4" w:space="0" w:color="000000"/>
@@ -9727,7 +9545,7 @@
         </w:tc>
         <w:tc>
           <w:tcPr>
-            <w:tcW w:w="4166" w:type="dxa"/>
+            <w:tcW w:w="4168" w:type="dxa"/>
             <w:tcBorders>
               <w:bottom w:val="single" w:sz="4" w:space="0" w:color="000000"/>
               <w:end w:val="single" w:sz="4" w:space="0" w:color="000000"/>
@@ -9767,7 +9585,7 @@
         </w:trPr>
         <w:tc>
           <w:tcPr>
-            <w:tcW w:w="3176" w:type="dxa"/>
+            <w:tcW w:w="3057" w:type="dxa"/>
             <w:tcBorders>
               <w:start w:val="single" w:sz="4" w:space="0" w:color="000000"/>
               <w:bottom w:val="single" w:sz="4" w:space="0" w:color="000000"/>
@@ -9803,7 +9621,7 @@
         </w:tc>
         <w:tc>
           <w:tcPr>
-            <w:tcW w:w="1846" w:type="dxa"/>
+            <w:tcW w:w="1857" w:type="dxa"/>
             <w:tcBorders>
               <w:bottom w:val="single" w:sz="4" w:space="0" w:color="000000"/>
               <w:end w:val="single" w:sz="4" w:space="0" w:color="000000"/>
@@ -9838,7 +9656,7 @@
         </w:tc>
         <w:tc>
           <w:tcPr>
-            <w:tcW w:w="1334" w:type="dxa"/>
+            <w:tcW w:w="1326" w:type="dxa"/>
             <w:tcBorders>
               <w:bottom w:val="single" w:sz="4" w:space="0" w:color="000000"/>
               <w:end w:val="single" w:sz="4" w:space="0" w:color="000000"/>
@@ -9873,7 +9691,7 @@
         </w:tc>
         <w:tc>
           <w:tcPr>
-            <w:tcW w:w="4166" w:type="dxa"/>
+            <w:tcW w:w="4168" w:type="dxa"/>
             <w:tcBorders>
               <w:bottom w:val="single" w:sz="4" w:space="0" w:color="000000"/>
               <w:end w:val="single" w:sz="4" w:space="0" w:color="000000"/>
@@ -9913,7 +9731,7 @@
         </w:trPr>
         <w:tc>
           <w:tcPr>
-            <w:tcW w:w="3176" w:type="dxa"/>
+            <w:tcW w:w="3057" w:type="dxa"/>
             <w:tcBorders>
               <w:start w:val="single" w:sz="4" w:space="0" w:color="000000"/>
               <w:bottom w:val="single" w:sz="4" w:space="0" w:color="000000"/>
@@ -9949,7 +9767,7 @@
         </w:tc>
         <w:tc>
           <w:tcPr>
-            <w:tcW w:w="1846" w:type="dxa"/>
+            <w:tcW w:w="1857" w:type="dxa"/>
             <w:tcBorders>
               <w:bottom w:val="single" w:sz="4" w:space="0" w:color="000000"/>
               <w:end w:val="single" w:sz="4" w:space="0" w:color="000000"/>
@@ -9984,7 +9802,7 @@
         </w:tc>
         <w:tc>
           <w:tcPr>
-            <w:tcW w:w="1334" w:type="dxa"/>
+            <w:tcW w:w="1326" w:type="dxa"/>
             <w:tcBorders>
               <w:bottom w:val="single" w:sz="4" w:space="0" w:color="000000"/>
               <w:end w:val="single" w:sz="4" w:space="0" w:color="000000"/>
@@ -10019,7 +9837,7 @@
         </w:tc>
         <w:tc>
           <w:tcPr>
-            <w:tcW w:w="4166" w:type="dxa"/>
+            <w:tcW w:w="4168" w:type="dxa"/>
             <w:tcBorders>
               <w:bottom w:val="single" w:sz="4" w:space="0" w:color="000000"/>
               <w:end w:val="single" w:sz="4" w:space="0" w:color="000000"/>
@@ -10059,7 +9877,7 @@
         </w:trPr>
         <w:tc>
           <w:tcPr>
-            <w:tcW w:w="3176" w:type="dxa"/>
+            <w:tcW w:w="3057" w:type="dxa"/>
             <w:tcBorders>
               <w:start w:val="single" w:sz="4" w:space="0" w:color="000000"/>
               <w:bottom w:val="single" w:sz="4" w:space="0" w:color="000000"/>
@@ -10095,7 +9913,7 @@
         </w:tc>
         <w:tc>
           <w:tcPr>
-            <w:tcW w:w="1846" w:type="dxa"/>
+            <w:tcW w:w="1857" w:type="dxa"/>
             <w:tcBorders>
               <w:bottom w:val="single" w:sz="4" w:space="0" w:color="000000"/>
               <w:end w:val="single" w:sz="4" w:space="0" w:color="000000"/>
@@ -10130,7 +9948,7 @@
         </w:tc>
         <w:tc>
           <w:tcPr>
-            <w:tcW w:w="1334" w:type="dxa"/>
+            <w:tcW w:w="1326" w:type="dxa"/>
             <w:tcBorders>
               <w:bottom w:val="single" w:sz="4" w:space="0" w:color="000000"/>
               <w:end w:val="single" w:sz="4" w:space="0" w:color="000000"/>
@@ -10165,7 +9983,7 @@
         </w:tc>
         <w:tc>
           <w:tcPr>
-            <w:tcW w:w="4166" w:type="dxa"/>
+            <w:tcW w:w="4168" w:type="dxa"/>
             <w:tcBorders>
               <w:bottom w:val="single" w:sz="4" w:space="0" w:color="000000"/>
               <w:end w:val="single" w:sz="4" w:space="0" w:color="000000"/>
@@ -10205,7 +10023,7 @@
         </w:trPr>
         <w:tc>
           <w:tcPr>
-            <w:tcW w:w="3176" w:type="dxa"/>
+            <w:tcW w:w="3057" w:type="dxa"/>
             <w:tcBorders>
               <w:start w:val="single" w:sz="4" w:space="0" w:color="000000"/>
               <w:bottom w:val="single" w:sz="4" w:space="0" w:color="000000"/>
@@ -10241,7 +10059,7 @@
         </w:tc>
         <w:tc>
           <w:tcPr>
-            <w:tcW w:w="1846" w:type="dxa"/>
+            <w:tcW w:w="1857" w:type="dxa"/>
             <w:tcBorders>
               <w:bottom w:val="single" w:sz="4" w:space="0" w:color="000000"/>
               <w:end w:val="single" w:sz="4" w:space="0" w:color="000000"/>
@@ -10276,7 +10094,7 @@
         </w:tc>
         <w:tc>
           <w:tcPr>
-            <w:tcW w:w="1334" w:type="dxa"/>
+            <w:tcW w:w="1326" w:type="dxa"/>
             <w:tcBorders>
               <w:bottom w:val="single" w:sz="4" w:space="0" w:color="000000"/>
               <w:end w:val="single" w:sz="4" w:space="0" w:color="000000"/>
@@ -10311,7 +10129,7 @@
         </w:tc>
         <w:tc>
           <w:tcPr>
-            <w:tcW w:w="4166" w:type="dxa"/>
+            <w:tcW w:w="4168" w:type="dxa"/>
             <w:tcBorders>
               <w:bottom w:val="single" w:sz="4" w:space="0" w:color="000000"/>
               <w:end w:val="single" w:sz="4" w:space="0" w:color="000000"/>
@@ -10351,7 +10169,7 @@
         </w:trPr>
         <w:tc>
           <w:tcPr>
-            <w:tcW w:w="3176" w:type="dxa"/>
+            <w:tcW w:w="3057" w:type="dxa"/>
             <w:tcBorders>
               <w:start w:val="single" w:sz="4" w:space="0" w:color="000000"/>
               <w:bottom w:val="single" w:sz="4" w:space="0" w:color="000000"/>
@@ -10387,7 +10205,7 @@
         </w:tc>
         <w:tc>
           <w:tcPr>
-            <w:tcW w:w="1846" w:type="dxa"/>
+            <w:tcW w:w="1857" w:type="dxa"/>
             <w:tcBorders>
               <w:bottom w:val="single" w:sz="4" w:space="0" w:color="000000"/>
               <w:end w:val="single" w:sz="4" w:space="0" w:color="000000"/>
@@ -10422,7 +10240,7 @@
         </w:tc>
         <w:tc>
           <w:tcPr>
-            <w:tcW w:w="1334" w:type="dxa"/>
+            <w:tcW w:w="1326" w:type="dxa"/>
             <w:tcBorders>
               <w:bottom w:val="single" w:sz="4" w:space="0" w:color="000000"/>
               <w:end w:val="single" w:sz="4" w:space="0" w:color="000000"/>
@@ -10457,7 +10275,7 @@
         </w:tc>
         <w:tc>
           <w:tcPr>
-            <w:tcW w:w="4166" w:type="dxa"/>
+            <w:tcW w:w="4168" w:type="dxa"/>
             <w:tcBorders>
               <w:bottom w:val="single" w:sz="4" w:space="0" w:color="000000"/>
               <w:end w:val="single" w:sz="4" w:space="0" w:color="000000"/>
@@ -10497,7 +10315,7 @@
         </w:trPr>
         <w:tc>
           <w:tcPr>
-            <w:tcW w:w="3176" w:type="dxa"/>
+            <w:tcW w:w="3057" w:type="dxa"/>
             <w:tcBorders>
               <w:start w:val="single" w:sz="4" w:space="0" w:color="000000"/>
               <w:bottom w:val="single" w:sz="4" w:space="0" w:color="000000"/>
@@ -10533,7 +10351,7 @@
         </w:tc>
         <w:tc>
           <w:tcPr>
-            <w:tcW w:w="1846" w:type="dxa"/>
+            <w:tcW w:w="1857" w:type="dxa"/>
             <w:tcBorders>
               <w:bottom w:val="single" w:sz="4" w:space="0" w:color="000000"/>
               <w:end w:val="single" w:sz="4" w:space="0" w:color="000000"/>
@@ -10568,7 +10386,7 @@
         </w:tc>
         <w:tc>
           <w:tcPr>
-            <w:tcW w:w="1334" w:type="dxa"/>
+            <w:tcW w:w="1326" w:type="dxa"/>
             <w:tcBorders>
               <w:bottom w:val="single" w:sz="4" w:space="0" w:color="000000"/>
               <w:end w:val="single" w:sz="4" w:space="0" w:color="000000"/>
@@ -10603,7 +10421,7 @@
         </w:tc>
         <w:tc>
           <w:tcPr>
-            <w:tcW w:w="4166" w:type="dxa"/>
+            <w:tcW w:w="4168" w:type="dxa"/>
             <w:tcBorders>
               <w:bottom w:val="single" w:sz="4" w:space="0" w:color="000000"/>
               <w:end w:val="single" w:sz="4" w:space="0" w:color="000000"/>
@@ -10643,7 +10461,7 @@
         </w:trPr>
         <w:tc>
           <w:tcPr>
-            <w:tcW w:w="3176" w:type="dxa"/>
+            <w:tcW w:w="3057" w:type="dxa"/>
             <w:tcBorders>
               <w:start w:val="single" w:sz="4" w:space="0" w:color="000000"/>
               <w:bottom w:val="single" w:sz="4" w:space="0" w:color="000000"/>
@@ -10679,7 +10497,7 @@
         </w:tc>
         <w:tc>
           <w:tcPr>
-            <w:tcW w:w="1846" w:type="dxa"/>
+            <w:tcW w:w="1857" w:type="dxa"/>
             <w:tcBorders>
               <w:bottom w:val="single" w:sz="4" w:space="0" w:color="000000"/>
               <w:end w:val="single" w:sz="4" w:space="0" w:color="000000"/>
@@ -10714,7 +10532,7 @@
         </w:tc>
         <w:tc>
           <w:tcPr>
-            <w:tcW w:w="1334" w:type="dxa"/>
+            <w:tcW w:w="1326" w:type="dxa"/>
             <w:tcBorders>
               <w:bottom w:val="single" w:sz="4" w:space="0" w:color="000000"/>
               <w:end w:val="single" w:sz="4" w:space="0" w:color="000000"/>
@@ -10749,7 +10567,7 @@
         </w:tc>
         <w:tc>
           <w:tcPr>
-            <w:tcW w:w="4166" w:type="dxa"/>
+            <w:tcW w:w="4168" w:type="dxa"/>
             <w:tcBorders>
               <w:bottom w:val="single" w:sz="4" w:space="0" w:color="000000"/>
               <w:end w:val="single" w:sz="4" w:space="0" w:color="000000"/>
@@ -10789,7 +10607,7 @@
         </w:trPr>
         <w:tc>
           <w:tcPr>
-            <w:tcW w:w="3176" w:type="dxa"/>
+            <w:tcW w:w="3057" w:type="dxa"/>
             <w:tcBorders>
               <w:start w:val="single" w:sz="4" w:space="0" w:color="000000"/>
               <w:bottom w:val="single" w:sz="4" w:space="0" w:color="000000"/>
@@ -10825,7 +10643,7 @@
         </w:tc>
         <w:tc>
           <w:tcPr>
-            <w:tcW w:w="1846" w:type="dxa"/>
+            <w:tcW w:w="1857" w:type="dxa"/>
             <w:tcBorders>
               <w:bottom w:val="single" w:sz="4" w:space="0" w:color="000000"/>
               <w:end w:val="single" w:sz="4" w:space="0" w:color="000000"/>
@@ -10860,7 +10678,7 @@
         </w:tc>
         <w:tc>
           <w:tcPr>
-            <w:tcW w:w="1334" w:type="dxa"/>
+            <w:tcW w:w="1326" w:type="dxa"/>
             <w:tcBorders>
               <w:bottom w:val="single" w:sz="4" w:space="0" w:color="000000"/>
               <w:end w:val="single" w:sz="4" w:space="0" w:color="000000"/>
@@ -10895,7 +10713,7 @@
         </w:tc>
         <w:tc>
           <w:tcPr>
-            <w:tcW w:w="4166" w:type="dxa"/>
+            <w:tcW w:w="4168" w:type="dxa"/>
             <w:tcBorders>
               <w:bottom w:val="single" w:sz="4" w:space="0" w:color="000000"/>
               <w:end w:val="single" w:sz="4" w:space="0" w:color="000000"/>
@@ -10935,7 +10753,7 @@
         </w:trPr>
         <w:tc>
           <w:tcPr>
-            <w:tcW w:w="3176" w:type="dxa"/>
+            <w:tcW w:w="3057" w:type="dxa"/>
             <w:tcBorders>
               <w:start w:val="single" w:sz="4" w:space="0" w:color="000000"/>
               <w:bottom w:val="single" w:sz="4" w:space="0" w:color="000000"/>
@@ -10965,13 +10783,23 @@
                 <w:szCs w:val="24"/>
                 <w:lang w:val="en-IN" w:eastAsia="en-IN"/>
               </w:rPr>
-              <w:t>Ext CC and PO</w:t>
-            </w:r>
-          </w:p>
-        </w:tc>
-        <w:tc>
-          <w:tcPr>
-            <w:tcW w:w="1846" w:type="dxa"/>
+              <w:t>Ext</w:t>
+            </w:r>
+            <w:r>
+              <w:rPr>
+                <w:rFonts w:eastAsia="Times New Roman" w:cs="Calibri" w:ascii="Calibri" w:hAnsi="Calibri"/>
+                <w:color w:val="000000"/>
+                <w:sz w:val="24"/>
+                <w:szCs w:val="24"/>
+                <w:lang w:val="en-IN" w:eastAsia="en-IN"/>
+              </w:rPr>
+              <w:t>end Company Code and Purchase Org To</w:t>
+            </w:r>
+          </w:p>
+        </w:tc>
+        <w:tc>
+          <w:tcPr>
+            <w:tcW w:w="1857" w:type="dxa"/>
             <w:tcBorders>
               <w:bottom w:val="single" w:sz="4" w:space="0" w:color="000000"/>
               <w:end w:val="single" w:sz="4" w:space="0" w:color="000000"/>
@@ -11006,7 +10834,7 @@
         </w:tc>
         <w:tc>
           <w:tcPr>
-            <w:tcW w:w="1334" w:type="dxa"/>
+            <w:tcW w:w="1326" w:type="dxa"/>
             <w:tcBorders>
               <w:bottom w:val="single" w:sz="4" w:space="0" w:color="000000"/>
               <w:end w:val="single" w:sz="4" w:space="0" w:color="000000"/>
@@ -11041,7 +10869,7 @@
         </w:tc>
         <w:tc>
           <w:tcPr>
-            <w:tcW w:w="4166" w:type="dxa"/>
+            <w:tcW w:w="4168" w:type="dxa"/>
             <w:tcBorders>
               <w:bottom w:val="single" w:sz="4" w:space="0" w:color="000000"/>
               <w:end w:val="single" w:sz="4" w:space="0" w:color="000000"/>
@@ -11081,7 +10909,7 @@
         </w:trPr>
         <w:tc>
           <w:tcPr>
-            <w:tcW w:w="3176" w:type="dxa"/>
+            <w:tcW w:w="3057" w:type="dxa"/>
             <w:tcBorders>
               <w:start w:val="single" w:sz="4" w:space="0" w:color="000000"/>
               <w:bottom w:val="single" w:sz="4" w:space="0" w:color="000000"/>
@@ -11117,7 +10945,7 @@
         </w:tc>
         <w:tc>
           <w:tcPr>
-            <w:tcW w:w="1846" w:type="dxa"/>
+            <w:tcW w:w="1857" w:type="dxa"/>
             <w:tcBorders>
               <w:bottom w:val="single" w:sz="4" w:space="0" w:color="000000"/>
               <w:end w:val="single" w:sz="4" w:space="0" w:color="000000"/>
@@ -11152,7 +10980,7 @@
         </w:tc>
         <w:tc>
           <w:tcPr>
-            <w:tcW w:w="1334" w:type="dxa"/>
+            <w:tcW w:w="1326" w:type="dxa"/>
             <w:tcBorders>
               <w:bottom w:val="single" w:sz="4" w:space="0" w:color="000000"/>
               <w:end w:val="single" w:sz="4" w:space="0" w:color="000000"/>
@@ -11187,7 +11015,7 @@
         </w:tc>
         <w:tc>
           <w:tcPr>
-            <w:tcW w:w="4166" w:type="dxa"/>
+            <w:tcW w:w="4168" w:type="dxa"/>
             <w:tcBorders>
               <w:bottom w:val="single" w:sz="4" w:space="0" w:color="000000"/>
               <w:end w:val="single" w:sz="4" w:space="0" w:color="000000"/>
@@ -11245,7 +11073,7 @@
         </w:trPr>
         <w:tc>
           <w:tcPr>
-            <w:tcW w:w="3176" w:type="dxa"/>
+            <w:tcW w:w="3057" w:type="dxa"/>
             <w:tcBorders>
               <w:start w:val="single" w:sz="4" w:space="0" w:color="000000"/>
               <w:bottom w:val="single" w:sz="4" w:space="0" w:color="000000"/>
@@ -11281,7 +11109,7 @@
         </w:tc>
         <w:tc>
           <w:tcPr>
-            <w:tcW w:w="1846" w:type="dxa"/>
+            <w:tcW w:w="1857" w:type="dxa"/>
             <w:tcBorders>
               <w:bottom w:val="single" w:sz="4" w:space="0" w:color="000000"/>
               <w:end w:val="single" w:sz="4" w:space="0" w:color="000000"/>
@@ -11316,7 +11144,7 @@
         </w:tc>
         <w:tc>
           <w:tcPr>
-            <w:tcW w:w="1334" w:type="dxa"/>
+            <w:tcW w:w="1326" w:type="dxa"/>
             <w:tcBorders>
               <w:bottom w:val="single" w:sz="4" w:space="0" w:color="000000"/>
               <w:end w:val="single" w:sz="4" w:space="0" w:color="000000"/>
@@ -11351,7 +11179,7 @@
         </w:tc>
         <w:tc>
           <w:tcPr>
-            <w:tcW w:w="4166" w:type="dxa"/>
+            <w:tcW w:w="4168" w:type="dxa"/>
             <w:tcBorders>
               <w:bottom w:val="single" w:sz="4" w:space="0" w:color="000000"/>
               <w:end w:val="single" w:sz="4" w:space="0" w:color="000000"/>
@@ -11383,7 +11211,27 @@
               <w:t>The dropdown values should be populated from the 7th column of EDV: COMPANY_CODE_PURCHASE_NEW or from the 7th column of Reference Table 1.2.</w:t>
               <w:br/>
               <w:br/>
-              <w:t>The Company Code values must populate dynamically based on:</w:t>
+              <w:t xml:space="preserve">The </w:t>
+            </w:r>
+            <w:r>
+              <w:rPr>
+                <w:rFonts w:eastAsia="Times New Roman" w:cs="Calibri" w:ascii="Calibri" w:hAnsi="Calibri"/>
+                <w:color w:val="000000"/>
+                <w:sz w:val="24"/>
+                <w:szCs w:val="24"/>
+                <w:lang w:val="en-IN" w:eastAsia="en-IN"/>
+              </w:rPr>
+              <w:t>Purchase Org</w:t>
+            </w:r>
+            <w:r>
+              <w:rPr>
+                <w:rFonts w:eastAsia="Times New Roman" w:cs="Calibri" w:ascii="Calibri" w:hAnsi="Calibri"/>
+                <w:color w:val="000000"/>
+                <w:sz w:val="24"/>
+                <w:szCs w:val="24"/>
+                <w:lang w:val="en-IN" w:eastAsia="en-IN"/>
+              </w:rPr>
+              <w:t xml:space="preserve"> values must populate dynamically based on:</w:t>
               <w:br/>
               <w:br/>
               <w:t>The selected Group under “Choose the Group of Company (from Basic Details panel)”</w:t>
@@ -11416,7 +11264,7 @@
         </w:trPr>
         <w:tc>
           <w:tcPr>
-            <w:tcW w:w="3176" w:type="dxa"/>
+            <w:tcW w:w="3057" w:type="dxa"/>
             <w:tcBorders>
               <w:start w:val="single" w:sz="4" w:space="0" w:color="000000"/>
               <w:bottom w:val="single" w:sz="4" w:space="0" w:color="000000"/>
@@ -11452,7 +11300,7 @@
         </w:tc>
         <w:tc>
           <w:tcPr>
-            <w:tcW w:w="1846" w:type="dxa"/>
+            <w:tcW w:w="1857" w:type="dxa"/>
             <w:tcBorders>
               <w:bottom w:val="single" w:sz="4" w:space="0" w:color="000000"/>
               <w:end w:val="single" w:sz="4" w:space="0" w:color="000000"/>
@@ -11487,7 +11335,7 @@
         </w:tc>
         <w:tc>
           <w:tcPr>
-            <w:tcW w:w="1334" w:type="dxa"/>
+            <w:tcW w:w="1326" w:type="dxa"/>
             <w:tcBorders>
               <w:bottom w:val="single" w:sz="4" w:space="0" w:color="000000"/>
               <w:end w:val="single" w:sz="4" w:space="0" w:color="000000"/>
@@ -11522,7 +11370,7 @@
         </w:tc>
         <w:tc>
           <w:tcPr>
-            <w:tcW w:w="4166" w:type="dxa"/>
+            <w:tcW w:w="4168" w:type="dxa"/>
             <w:tcBorders>
               <w:bottom w:val="single" w:sz="4" w:space="0" w:color="000000"/>
               <w:end w:val="single" w:sz="4" w:space="0" w:color="000000"/>
@@ -11562,7 +11410,7 @@
         </w:trPr>
         <w:tc>
           <w:tcPr>
-            <w:tcW w:w="3176" w:type="dxa"/>
+            <w:tcW w:w="3057" w:type="dxa"/>
             <w:tcBorders>
               <w:start w:val="single" w:sz="4" w:space="0" w:color="000000"/>
               <w:bottom w:val="single" w:sz="4" w:space="0" w:color="000000"/>
@@ -11598,7 +11446,7 @@
         </w:tc>
         <w:tc>
           <w:tcPr>
-            <w:tcW w:w="1846" w:type="dxa"/>
+            <w:tcW w:w="1857" w:type="dxa"/>
             <w:tcBorders>
               <w:bottom w:val="single" w:sz="4" w:space="0" w:color="000000"/>
               <w:end w:val="single" w:sz="4" w:space="0" w:color="000000"/>
@@ -11633,7 +11481,7 @@
         </w:tc>
         <w:tc>
           <w:tcPr>
-            <w:tcW w:w="1334" w:type="dxa"/>
+            <w:tcW w:w="1326" w:type="dxa"/>
             <w:tcBorders>
               <w:bottom w:val="single" w:sz="4" w:space="0" w:color="000000"/>
               <w:end w:val="single" w:sz="4" w:space="0" w:color="000000"/>
@@ -11668,7 +11516,7 @@
         </w:tc>
         <w:tc>
           <w:tcPr>
-            <w:tcW w:w="4166" w:type="dxa"/>
+            <w:tcW w:w="4168" w:type="dxa"/>
             <w:tcBorders>
               <w:bottom w:val="single" w:sz="4" w:space="0" w:color="000000"/>
               <w:end w:val="single" w:sz="4" w:space="0" w:color="000000"/>
@@ -11706,7 +11554,7 @@
         </w:trPr>
         <w:tc>
           <w:tcPr>
-            <w:tcW w:w="3176" w:type="dxa"/>
+            <w:tcW w:w="3057" w:type="dxa"/>
             <w:tcBorders>
               <w:start w:val="single" w:sz="4" w:space="0" w:color="000000"/>
               <w:bottom w:val="single" w:sz="4" w:space="0" w:color="000000"/>
@@ -11742,7 +11590,7 @@
         </w:tc>
         <w:tc>
           <w:tcPr>
-            <w:tcW w:w="1846" w:type="dxa"/>
+            <w:tcW w:w="1857" w:type="dxa"/>
             <w:tcBorders>
               <w:bottom w:val="single" w:sz="4" w:space="0" w:color="000000"/>
               <w:end w:val="single" w:sz="4" w:space="0" w:color="000000"/>
@@ -11777,7 +11625,7 @@
         </w:tc>
         <w:tc>
           <w:tcPr>
-            <w:tcW w:w="1334" w:type="dxa"/>
+            <w:tcW w:w="1326" w:type="dxa"/>
             <w:tcBorders>
               <w:bottom w:val="single" w:sz="4" w:space="0" w:color="000000"/>
               <w:end w:val="single" w:sz="4" w:space="0" w:color="000000"/>
@@ -11812,7 +11660,7 @@
         </w:tc>
         <w:tc>
           <w:tcPr>
-            <w:tcW w:w="4166" w:type="dxa"/>
+            <w:tcW w:w="4168" w:type="dxa"/>
             <w:tcBorders>
               <w:bottom w:val="single" w:sz="4" w:space="0" w:color="000000"/>
               <w:end w:val="single" w:sz="4" w:space="0" w:color="000000"/>
@@ -11852,7 +11700,7 @@
         </w:trPr>
         <w:tc>
           <w:tcPr>
-            <w:tcW w:w="3176" w:type="dxa"/>
+            <w:tcW w:w="3057" w:type="dxa"/>
             <w:tcBorders>
               <w:start w:val="single" w:sz="4" w:space="0" w:color="000000"/>
               <w:bottom w:val="single" w:sz="4" w:space="0" w:color="000000"/>
@@ -11888,7 +11736,7 @@
         </w:tc>
         <w:tc>
           <w:tcPr>
-            <w:tcW w:w="1846" w:type="dxa"/>
+            <w:tcW w:w="1857" w:type="dxa"/>
             <w:tcBorders>
               <w:bottom w:val="single" w:sz="4" w:space="0" w:color="000000"/>
               <w:end w:val="single" w:sz="4" w:space="0" w:color="000000"/>
@@ -11923,7 +11771,7 @@
         </w:tc>
         <w:tc>
           <w:tcPr>
-            <w:tcW w:w="1334" w:type="dxa"/>
+            <w:tcW w:w="1326" w:type="dxa"/>
             <w:tcBorders>
               <w:bottom w:val="single" w:sz="4" w:space="0" w:color="000000"/>
               <w:end w:val="single" w:sz="4" w:space="0" w:color="000000"/>
@@ -11958,7 +11806,7 @@
         </w:tc>
         <w:tc>
           <w:tcPr>
-            <w:tcW w:w="4166" w:type="dxa"/>
+            <w:tcW w:w="4168" w:type="dxa"/>
             <w:tcBorders>
               <w:bottom w:val="single" w:sz="4" w:space="0" w:color="000000"/>
               <w:end w:val="single" w:sz="4" w:space="0" w:color="000000"/>
@@ -11988,6 +11836,152 @@
                 <w:lang w:val="en-IN" w:eastAsia="en-IN"/>
               </w:rPr>
               <w:t xml:space="preserve">Free text field </w:t>
+            </w:r>
+          </w:p>
+        </w:tc>
+      </w:tr>
+      <w:tr>
+        <w:trPr>
+          <w:trHeight w:val="312" w:hRule="atLeast"/>
+        </w:trPr>
+        <w:tc>
+          <w:tcPr>
+            <w:tcW w:w="3057" w:type="dxa"/>
+            <w:tcBorders>
+              <w:start w:val="single" w:sz="4" w:space="0" w:color="000000"/>
+              <w:bottom w:val="single" w:sz="4" w:space="0" w:color="000000"/>
+              <w:end w:val="single" w:sz="4" w:space="0" w:color="000000"/>
+            </w:tcBorders>
+            <w:vAlign w:val="bottom"/>
+          </w:tcPr>
+          <w:p>
+            <w:pPr>
+              <w:pStyle w:val="Normal"/>
+              <w:spacing w:lineRule="auto" w:line="240" w:before="0" w:after="0"/>
+              <w:ind w:start="0"/>
+              <w:jc w:val="start"/>
+              <w:rPr>
+                <w:rFonts w:ascii="Calibri" w:hAnsi="Calibri" w:eastAsia="Times New Roman" w:cs="Calibri"/>
+                <w:color w:val="000000"/>
+                <w:sz w:val="24"/>
+                <w:szCs w:val="24"/>
+                <w:lang w:val="en-IN" w:eastAsia="en-IN"/>
+              </w:rPr>
+            </w:pPr>
+            <w:r>
+              <w:rPr>
+                <w:rFonts w:eastAsia="Times New Roman" w:cs="Calibri" w:ascii="Calibri" w:hAnsi="Calibri"/>
+                <w:color w:val="000000"/>
+                <w:sz w:val="24"/>
+                <w:szCs w:val="24"/>
+                <w:lang w:val="en-IN" w:eastAsia="en-IN"/>
+              </w:rPr>
+              <w:t>Extend To Group Company</w:t>
+            </w:r>
+          </w:p>
+        </w:tc>
+        <w:tc>
+          <w:tcPr>
+            <w:tcW w:w="1857" w:type="dxa"/>
+            <w:tcBorders>
+              <w:bottom w:val="single" w:sz="4" w:space="0" w:color="000000"/>
+              <w:end w:val="single" w:sz="4" w:space="0" w:color="000000"/>
+            </w:tcBorders>
+            <w:vAlign w:val="bottom"/>
+          </w:tcPr>
+          <w:p>
+            <w:pPr>
+              <w:pStyle w:val="Normal"/>
+              <w:spacing w:lineRule="auto" w:line="240" w:before="0" w:after="0"/>
+              <w:ind w:start="0"/>
+              <w:jc w:val="center"/>
+              <w:rPr>
+                <w:rFonts w:ascii="Calibri" w:hAnsi="Calibri" w:eastAsia="Times New Roman" w:cs="Calibri"/>
+                <w:color w:val="000000"/>
+                <w:sz w:val="24"/>
+                <w:szCs w:val="24"/>
+                <w:lang w:val="en-IN" w:eastAsia="en-IN"/>
+              </w:rPr>
+            </w:pPr>
+            <w:r>
+              <w:rPr>
+                <w:rFonts w:eastAsia="Times New Roman" w:cs="Calibri" w:ascii="Calibri" w:hAnsi="Calibri"/>
+                <w:color w:val="000000"/>
+                <w:sz w:val="24"/>
+                <w:szCs w:val="24"/>
+                <w:lang w:val="en-IN" w:eastAsia="en-IN"/>
+              </w:rPr>
+              <w:t>Dropdown</w:t>
+            </w:r>
+          </w:p>
+        </w:tc>
+        <w:tc>
+          <w:tcPr>
+            <w:tcW w:w="1326" w:type="dxa"/>
+            <w:tcBorders>
+              <w:bottom w:val="single" w:sz="4" w:space="0" w:color="000000"/>
+              <w:end w:val="single" w:sz="4" w:space="0" w:color="000000"/>
+            </w:tcBorders>
+            <w:vAlign w:val="bottom"/>
+          </w:tcPr>
+          <w:p>
+            <w:pPr>
+              <w:pStyle w:val="Normal"/>
+              <w:spacing w:lineRule="auto" w:line="240" w:before="0" w:after="0"/>
+              <w:ind w:start="0"/>
+              <w:jc w:val="center"/>
+              <w:rPr>
+                <w:rFonts w:ascii="Calibri" w:hAnsi="Calibri" w:eastAsia="Times New Roman" w:cs="Calibri"/>
+                <w:color w:val="000000"/>
+                <w:sz w:val="24"/>
+                <w:szCs w:val="24"/>
+                <w:lang w:val="en-IN" w:eastAsia="en-IN"/>
+              </w:rPr>
+            </w:pPr>
+            <w:r>
+              <w:rPr>
+                <w:rFonts w:eastAsia="Times New Roman" w:cs="Calibri" w:ascii="Calibri" w:hAnsi="Calibri"/>
+                <w:color w:val="000000"/>
+                <w:sz w:val="24"/>
+                <w:szCs w:val="24"/>
+                <w:lang w:val="en-IN" w:eastAsia="en-IN"/>
+              </w:rPr>
+              <w:t>TRUE</w:t>
+            </w:r>
+          </w:p>
+        </w:tc>
+        <w:tc>
+          <w:tcPr>
+            <w:tcW w:w="4168" w:type="dxa"/>
+            <w:tcBorders>
+              <w:bottom w:val="single" w:sz="4" w:space="0" w:color="000000"/>
+              <w:end w:val="single" w:sz="4" w:space="0" w:color="000000"/>
+            </w:tcBorders>
+            <w:vAlign w:val="bottom"/>
+          </w:tcPr>
+          <w:p>
+            <w:pPr>
+              <w:pStyle w:val="Normal"/>
+              <w:spacing w:lineRule="auto" w:line="240" w:before="0" w:after="0"/>
+              <w:ind w:start="0"/>
+              <w:jc w:val="start"/>
+              <w:rPr>
+                <w:rFonts w:ascii="Calibri" w:hAnsi="Calibri" w:eastAsia="Times New Roman" w:cs="Calibri"/>
+                <w:color w:val="000000"/>
+                <w:sz w:val="24"/>
+                <w:szCs w:val="24"/>
+                <w:lang w:val="en-IN" w:eastAsia="en-IN"/>
+              </w:rPr>
+            </w:pPr>
+            <w:r>
+              <w:rPr>
+                <w:rFonts w:eastAsia="Times New Roman" w:cs="Calibri" w:ascii="Calibri" w:hAnsi="Calibri"/>
+                <w:color w:val="000000"/>
+                <w:sz w:val="24"/>
+                <w:szCs w:val="24"/>
+                <w:lang w:val="en-IN" w:eastAsia="en-IN"/>
+              </w:rPr>
+              <w:t>Dropdown values will be derived from the first column of the EDV reference table: COMPANY_CODE_PURCHASE_NEW</w:t>
             </w:r>
           </w:p>
         </w:tc>
@@ -11998,7 +11992,7 @@
         </w:trPr>
         <w:tc>
           <w:tcPr>
-            <w:tcW w:w="3176" w:type="dxa"/>
+            <w:tcW w:w="3057" w:type="dxa"/>
             <w:tcBorders>
               <w:start w:val="single" w:sz="4" w:space="0" w:color="000000"/>
               <w:bottom w:val="single" w:sz="4" w:space="0" w:color="000000"/>
@@ -12034,7 +12028,7 @@
         </w:tc>
         <w:tc>
           <w:tcPr>
-            <w:tcW w:w="1846" w:type="dxa"/>
+            <w:tcW w:w="1857" w:type="dxa"/>
             <w:tcBorders>
               <w:bottom w:val="single" w:sz="4" w:space="0" w:color="000000"/>
               <w:end w:val="single" w:sz="4" w:space="0" w:color="000000"/>
@@ -12069,7 +12063,7 @@
         </w:tc>
         <w:tc>
           <w:tcPr>
-            <w:tcW w:w="1334" w:type="dxa"/>
+            <w:tcW w:w="1326" w:type="dxa"/>
             <w:tcBorders>
               <w:bottom w:val="single" w:sz="4" w:space="0" w:color="000000"/>
               <w:end w:val="single" w:sz="4" w:space="0" w:color="000000"/>
@@ -12104,7 +12098,7 @@
         </w:tc>
         <w:tc>
           <w:tcPr>
-            <w:tcW w:w="4166" w:type="dxa"/>
+            <w:tcW w:w="4168" w:type="dxa"/>
             <w:tcBorders>
               <w:bottom w:val="single" w:sz="4" w:space="0" w:color="000000"/>
               <w:end w:val="single" w:sz="4" w:space="0" w:color="000000"/>
@@ -23264,8 +23258,8 @@
           <w:szCs w:val="24"/>
         </w:rPr>
       </w:pPr>
-      <w:bookmarkStart w:id="17" w:name="_Toc217236652"/>
-      <w:bookmarkStart w:id="18" w:name="_Toc215605681"/>
+      <w:bookmarkStart w:id="17" w:name="_Toc215605681"/>
+      <w:bookmarkStart w:id="18" w:name="_Toc217236652"/>
       <w:r>
         <w:rPr>
           <w:sz w:val="24"/>
@@ -27946,7 +27940,7 @@
           <v:shape id="ole_rId5" type="_x0000_tole_rId5" style="width:76.25pt;height:49.4pt;mso-wrap-distance-right:0pt;mso-wrap-distance-bottom:12pt" filled="f" o:ole="">
             <v:imagedata r:id="rId6" o:title=""/>
           </v:shape>
-          <o:OLEObject Type="Embed" ProgID="Excel.Sheet.12" ShapeID="ole_rId5" DrawAspect="Icon" ObjectID="_653713170" r:id="rId5"/>
+          <o:OLEObject Type="Embed" ProgID="Excel.Sheet.12" ShapeID="ole_rId5" DrawAspect="Icon" ObjectID="_1736573520" r:id="rId5"/>
         </w:object>
       </w:r>
     </w:p>
@@ -28061,7 +28055,7 @@
           <v:shape id="ole_rId7" type="_x0000_tole_rId7" style="width:76.25pt;height:49.4pt;mso-wrap-distance-right:0pt" filled="f" o:ole="">
             <v:imagedata r:id="rId8" o:title=""/>
           </v:shape>
-          <o:OLEObject Type="Embed" ProgID="Excel.SheetMacroEnabled.12" ShapeID="ole_rId7" DrawAspect="Icon" ObjectID="_650466223" r:id="rId7"/>
+          <o:OLEObject Type="Embed" ProgID="Excel.SheetMacroEnabled.12" ShapeID="ole_rId7" DrawAspect="Icon" ObjectID="_571799394" r:id="rId7"/>
         </w:object>
       </w:r>
     </w:p>
@@ -28195,7 +28189,7 @@
           <v:shape id="ole_rId9" type="_x0000_tole_rId9" style="width:76.25pt;height:49.4pt;mso-wrap-distance-right:0pt" filled="f" o:ole="">
             <v:imagedata r:id="rId10" o:title=""/>
           </v:shape>
-          <o:OLEObject Type="Embed" ProgID="Excel.SheetMacroEnabled.12" ShapeID="ole_rId9" DrawAspect="Icon" ObjectID="_340755936" r:id="rId9"/>
+          <o:OLEObject Type="Embed" ProgID="Excel.SheetMacroEnabled.12" ShapeID="ole_rId9" DrawAspect="Icon" ObjectID="_410452323" r:id="rId9"/>
         </w:object>
       </w:r>
     </w:p>
@@ -28310,7 +28304,7 @@
           <v:shape id="ole_rId11" type="_x0000_tole_rId11" style="width:76.25pt;height:49.4pt;mso-wrap-distance-right:0pt" filled="f" o:ole="">
             <v:imagedata r:id="rId12" o:title=""/>
           </v:shape>
-          <o:OLEObject Type="Embed" ProgID="Excel.SheetMacroEnabled.12" ShapeID="ole_rId11" DrawAspect="Icon" ObjectID="_1806593405" r:id="rId11"/>
+          <o:OLEObject Type="Embed" ProgID="Excel.SheetMacroEnabled.12" ShapeID="ole_rId11" DrawAspect="Icon" ObjectID="_1972129118" r:id="rId11"/>
         </w:object>
       </w:r>
     </w:p>
@@ -28425,7 +28419,7 @@
           <v:shape id="ole_rId13" type="_x0000_tole_rId13" style="width:76.25pt;height:49.4pt;mso-wrap-distance-right:0pt" filled="f" o:ole="">
             <v:imagedata r:id="rId14" o:title=""/>
           </v:shape>
-          <o:OLEObject Type="Embed" ProgID="Excel.SheetMacroEnabled.12" ShapeID="ole_rId13" DrawAspect="Icon" ObjectID="_2128227200" r:id="rId13"/>
+          <o:OLEObject Type="Embed" ProgID="Excel.SheetMacroEnabled.12" ShapeID="ole_rId13" DrawAspect="Icon" ObjectID="_438376482" r:id="rId13"/>
         </w:object>
       </w:r>
     </w:p>
@@ -28559,7 +28553,7 @@
           <v:shape id="ole_rId15" type="_x0000_tole_rId15" style="width:76.25pt;height:49.4pt;mso-wrap-distance-right:0pt" filled="f" o:ole="">
             <v:imagedata r:id="rId16" o:title=""/>
           </v:shape>
-          <o:OLEObject Type="Embed" ProgID="Excel.SheetMacroEnabled.12" ShapeID="ole_rId15" DrawAspect="Icon" ObjectID="_291410424" r:id="rId15"/>
+          <o:OLEObject Type="Embed" ProgID="Excel.SheetMacroEnabled.12" ShapeID="ole_rId15" DrawAspect="Icon" ObjectID="_1163000615" r:id="rId15"/>
         </w:object>
       </w:r>
     </w:p>
@@ -28674,7 +28668,7 @@
           <v:shape id="ole_rId17" type="_x0000_tole_rId17" style="width:76.25pt;height:49.4pt;mso-wrap-distance-right:0pt" filled="f" o:ole="">
             <v:imagedata r:id="rId18" o:title=""/>
           </v:shape>
-          <o:OLEObject Type="Embed" ProgID="Excel.SheetMacroEnabled.12" ShapeID="ole_rId17" DrawAspect="Icon" ObjectID="_814471866" r:id="rId17"/>
+          <o:OLEObject Type="Embed" ProgID="Excel.SheetMacroEnabled.12" ShapeID="ole_rId17" DrawAspect="Icon" ObjectID="_1680761911" r:id="rId17"/>
         </w:object>
       </w:r>
     </w:p>
@@ -28789,7 +28783,7 @@
           <v:shape id="ole_rId19" type="_x0000_tole_rId19" style="width:76.25pt;height:49.4pt;mso-wrap-distance-right:0pt" filled="f" o:ole="">
             <v:imagedata r:id="rId20" o:title=""/>
           </v:shape>
-          <o:OLEObject Type="Embed" ProgID="Excel.SheetMacroEnabled.12" ShapeID="ole_rId19" DrawAspect="Icon" ObjectID="_280037925" r:id="rId19"/>
+          <o:OLEObject Type="Embed" ProgID="Excel.SheetMacroEnabled.12" ShapeID="ole_rId19" DrawAspect="Icon" ObjectID="_1114569121" r:id="rId19"/>
         </w:object>
       </w:r>
     </w:p>
@@ -28904,7 +28898,7 @@
           <v:shape id="ole_rId21" type="_x0000_tole_rId21" style="width:76.25pt;height:49.4pt;mso-wrap-distance-right:0pt" filled="f" o:ole="">
             <v:imagedata r:id="rId22" o:title=""/>
           </v:shape>
-          <o:OLEObject Type="Embed" ProgID="Excel.Sheet.12" ShapeID="ole_rId21" DrawAspect="Icon" ObjectID="_1816340452" r:id="rId21"/>
+          <o:OLEObject Type="Embed" ProgID="Excel.Sheet.12" ShapeID="ole_rId21" DrawAspect="Icon" ObjectID="_553592323" r:id="rId21"/>
         </w:object>
       </w:r>
     </w:p>
@@ -29019,7 +29013,7 @@
           <v:shape id="ole_rId23" type="_x0000_tole_rId23" style="width:76.25pt;height:49.4pt;mso-wrap-distance-right:0pt" filled="f" o:ole="">
             <v:imagedata r:id="rId24" o:title=""/>
           </v:shape>
-          <o:OLEObject Type="Embed" ProgID="Excel.Sheet.12" ShapeID="ole_rId23" DrawAspect="Icon" ObjectID="_618921900" r:id="rId23"/>
+          <o:OLEObject Type="Embed" ProgID="Excel.Sheet.12" ShapeID="ole_rId23" DrawAspect="Icon" ObjectID="_508547214" r:id="rId23"/>
         </w:object>
       </w:r>
     </w:p>
@@ -30452,9 +30446,9 @@
         <w:gridCol w:w="1038"/>
         <w:gridCol w:w="1625"/>
         <w:gridCol w:w="824"/>
-        <w:gridCol w:w="1831"/>
+        <w:gridCol w:w="1830"/>
         <w:gridCol w:w="1354"/>
-        <w:gridCol w:w="994"/>
+        <w:gridCol w:w="995"/>
         <w:gridCol w:w="1285"/>
       </w:tblGrid>
       <w:tr>
@@ -30611,7 +30605,7 @@
         </w:tc>
         <w:tc>
           <w:tcPr>
-            <w:tcW w:w="1831" w:type="dxa"/>
+            <w:tcW w:w="1830" w:type="dxa"/>
             <w:tcBorders>
               <w:top w:val="single" w:sz="4" w:space="0" w:color="000000"/>
               <w:start w:val="single" w:sz="4" w:space="0" w:color="000000"/>
@@ -30685,7 +30679,7 @@
         </w:tc>
         <w:tc>
           <w:tcPr>
-            <w:tcW w:w="994" w:type="dxa"/>
+            <w:tcW w:w="995" w:type="dxa"/>
             <w:tcBorders>
               <w:top w:val="single" w:sz="4" w:space="0" w:color="000000"/>
               <w:start w:val="single" w:sz="4" w:space="0" w:color="000000"/>
@@ -30912,7 +30906,7 @@
         </w:tc>
         <w:tc>
           <w:tcPr>
-            <w:tcW w:w="1831" w:type="dxa"/>
+            <w:tcW w:w="1830" w:type="dxa"/>
             <w:tcBorders>
               <w:top w:val="single" w:sz="4" w:space="0" w:color="000000"/>
               <w:start w:val="single" w:sz="4" w:space="0" w:color="000000"/>
@@ -30986,7 +30980,7 @@
         </w:tc>
         <w:tc>
           <w:tcPr>
-            <w:tcW w:w="994" w:type="dxa"/>
+            <w:tcW w:w="995" w:type="dxa"/>
             <w:tcBorders>
               <w:top w:val="single" w:sz="4" w:space="0" w:color="000000"/>
               <w:start w:val="single" w:sz="4" w:space="0" w:color="000000"/>
@@ -31213,7 +31207,7 @@
         </w:tc>
         <w:tc>
           <w:tcPr>
-            <w:tcW w:w="1831" w:type="dxa"/>
+            <w:tcW w:w="1830" w:type="dxa"/>
             <w:tcBorders>
               <w:top w:val="single" w:sz="4" w:space="0" w:color="000000"/>
               <w:start w:val="single" w:sz="4" w:space="0" w:color="000000"/>
@@ -31287,7 +31281,7 @@
         </w:tc>
         <w:tc>
           <w:tcPr>
-            <w:tcW w:w="994" w:type="dxa"/>
+            <w:tcW w:w="995" w:type="dxa"/>
             <w:tcBorders>
               <w:top w:val="single" w:sz="4" w:space="0" w:color="000000"/>
               <w:start w:val="single" w:sz="4" w:space="0" w:color="000000"/>
@@ -33225,7 +33219,7 @@
         <w:szCs w:val="22"/>
       </w:rPr>
       <w:drawing>
-        <wp:anchor distT="0" distB="0" distL="114300" distR="114300" simplePos="0" relativeHeight="84" behindDoc="1" locked="0" layoutInCell="0" allowOverlap="1">
+        <wp:anchor distT="0" distB="0" distL="114300" distR="114300" simplePos="0" relativeHeight="81" behindDoc="1" locked="0" layoutInCell="0" allowOverlap="1">
           <wp:simplePos x="0" y="0"/>
           <wp:positionH relativeFrom="margin">
             <wp:posOffset>-1267460</wp:posOffset>
@@ -33313,7 +33307,7 @@
     <w:r>
       <w:rPr/>
       <w:drawing>
-        <wp:anchor distT="0" distB="0" distL="114300" distR="114300" simplePos="0" relativeHeight="85" behindDoc="1" locked="0" layoutInCell="0" allowOverlap="1">
+        <wp:anchor distT="0" distB="0" distL="114300" distR="114300" simplePos="0" relativeHeight="82" behindDoc="1" locked="0" layoutInCell="0" allowOverlap="1">
           <wp:simplePos x="0" y="0"/>
           <wp:positionH relativeFrom="margin">
             <wp:posOffset>-1085850</wp:posOffset>
@@ -33398,7 +33392,7 @@
     </w:pPr>
     <w:r>
       <w:drawing>
-        <wp:anchor distT="0" distB="0" distL="0" distR="0" simplePos="0" relativeHeight="44" behindDoc="1" locked="0" layoutInCell="0" allowOverlap="1">
+        <wp:anchor distT="0" distB="0" distL="0" distR="0" simplePos="0" relativeHeight="41" behindDoc="1" locked="0" layoutInCell="0" allowOverlap="1">
           <wp:simplePos x="0" y="0"/>
           <wp:positionH relativeFrom="page">
             <wp:posOffset>-34925</wp:posOffset>
@@ -37718,15 +37712,15 @@
       <w:lang w:val="en-IN" w:eastAsia="en-IN"/>
     </w:rPr>
   </w:style>
-  <w:style w:type="paragraph" w:styleId="FrameContents" w:customStyle="1">
-    <w:name w:val="Frame Contents"/>
+  <w:style w:type="paragraph" w:styleId="FrameContentsuser" w:customStyle="1">
+    <w:name w:val="Frame Contents (user)"/>
     <w:basedOn w:val="Normal"/>
     <w:qFormat/>
     <w:pPr/>
     <w:rPr/>
   </w:style>
-  <w:style w:type="paragraph" w:styleId="FrameContentsuser">
-    <w:name w:val="Frame Contents (user)"/>
+  <w:style w:type="paragraph" w:styleId="FrameContents">
+    <w:name w:val="Frame Contents"/>
     <w:basedOn w:val="Normal"/>
     <w:qFormat/>
     <w:pPr/>

</xml_diff>